<commit_message>
Updated Data Input Section in Chain_APIs.docx.
</commit_message>
<xml_diff>
--- a/Portal_Database_Design/Chain_APIs.docx
+++ b/Portal_Database_Design/Chain_APIs.docx
@@ -16,8 +16,8 @@
         </w:tblCellMar>
       </w:tblPr>
       <w:tblGrid>
-        <w:gridCol w:w="1919"/>
-        <w:gridCol w:w="1936"/>
+        <w:gridCol w:w="1918"/>
+        <w:gridCol w:w="1937"/>
         <w:gridCol w:w="1921"/>
         <w:gridCol w:w="1934"/>
         <w:gridCol w:w="1928"/>
@@ -26,7 +26,7 @@
         <w:trPr/>
         <w:tc>
           <w:tcPr>
-            <w:tcW w:w="1919" w:type="dxa"/>
+            <w:tcW w:w="1918" w:type="dxa"/>
             <w:tcBorders>
               <w:top w:val="single" w:sz="4" w:space="0" w:color="000000"/>
               <w:start w:val="single" w:sz="4" w:space="0" w:color="000000"/>
@@ -76,7 +76,7 @@
         </w:tc>
         <w:tc>
           <w:tcPr>
-            <w:tcW w:w="1936" w:type="dxa"/>
+            <w:tcW w:w="1937" w:type="dxa"/>
             <w:tcBorders>
               <w:top w:val="single" w:sz="4" w:space="0" w:color="000000"/>
               <w:start w:val="single" w:sz="4" w:space="0" w:color="000000"/>
@@ -280,73 +280,56 @@
         <w:trPr/>
         <w:tc>
           <w:tcPr>
-            <w:tcW w:w="1919" w:type="dxa"/>
-            <w:tcBorders>
-              <w:start w:val="single" w:sz="4" w:space="0" w:color="000000"/>
-              <w:bottom w:val="single" w:sz="4" w:space="0" w:color="000000"/>
-            </w:tcBorders>
-          </w:tcPr>
-          <w:p>
-            <w:pPr>
-              <w:pStyle w:val="TableContents"/>
-              <w:bidi w:val="0"/>
-              <w:jc w:val="start"/>
-              <w:rPr>
-                <w:rFonts w:ascii="Liberation Serif" w:hAnsi="Liberation Serif"/>
-                <w:b w:val="false"/>
-                <w:bCs w:val="false"/>
-                <w:i w:val="false"/>
-                <w:i w:val="false"/>
-                <w:iCs w:val="false"/>
-                <w:strike w:val="false"/>
-                <w:dstrike w:val="false"/>
-                <w:outline w:val="false"/>
-                <w:shadow w:val="false"/>
-                <w:color w:val="000000"/>
-                <w:sz w:val="24"/>
-                <w:szCs w:val="24"/>
-                <w:u w:val="none"/>
-              </w:rPr>
-            </w:pPr>
-            <w:r>
-              <w:rPr>
-                <w:b w:val="false"/>
-                <w:bCs w:val="false"/>
-                <w:i w:val="false"/>
-                <w:iCs w:val="false"/>
-                <w:strike w:val="false"/>
-                <w:dstrike w:val="false"/>
-                <w:outline w:val="false"/>
-                <w:shadow w:val="false"/>
-                <w:color w:val="000000"/>
-                <w:sz w:val="24"/>
-                <w:szCs w:val="24"/>
-                <w:u w:val="none"/>
-              </w:rPr>
-              <w:t>c</w:t>
-            </w:r>
-            <w:r>
-              <w:rPr>
-                <w:b w:val="false"/>
-                <w:bCs w:val="false"/>
-                <w:i w:val="false"/>
-                <w:iCs w:val="false"/>
-                <w:strike w:val="false"/>
-                <w:dstrike w:val="false"/>
-                <w:outline w:val="false"/>
-                <w:shadow w:val="false"/>
-                <w:color w:val="000000"/>
-                <w:sz w:val="24"/>
-                <w:szCs w:val="24"/>
-                <w:u w:val="none"/>
-              </w:rPr>
-              <w:t>reateChain</w:t>
-            </w:r>
-          </w:p>
-        </w:tc>
-        <w:tc>
-          <w:tcPr>
-            <w:tcW w:w="1936" w:type="dxa"/>
+            <w:tcW w:w="1918" w:type="dxa"/>
+            <w:tcBorders>
+              <w:start w:val="single" w:sz="4" w:space="0" w:color="000000"/>
+              <w:bottom w:val="single" w:sz="4" w:space="0" w:color="000000"/>
+            </w:tcBorders>
+          </w:tcPr>
+          <w:p>
+            <w:pPr>
+              <w:pStyle w:val="TableContents"/>
+              <w:bidi w:val="0"/>
+              <w:jc w:val="start"/>
+              <w:rPr>
+                <w:rFonts w:ascii="Liberation Serif" w:hAnsi="Liberation Serif"/>
+                <w:b w:val="false"/>
+                <w:bCs w:val="false"/>
+                <w:i w:val="false"/>
+                <w:i w:val="false"/>
+                <w:iCs w:val="false"/>
+                <w:strike w:val="false"/>
+                <w:dstrike w:val="false"/>
+                <w:outline w:val="false"/>
+                <w:shadow w:val="false"/>
+                <w:color w:val="000000"/>
+                <w:sz w:val="24"/>
+                <w:szCs w:val="24"/>
+                <w:u w:val="none"/>
+              </w:rPr>
+            </w:pPr>
+            <w:r>
+              <w:rPr>
+                <w:b w:val="false"/>
+                <w:bCs w:val="false"/>
+                <w:i w:val="false"/>
+                <w:iCs w:val="false"/>
+                <w:strike w:val="false"/>
+                <w:dstrike w:val="false"/>
+                <w:outline w:val="false"/>
+                <w:shadow w:val="false"/>
+                <w:color w:val="000000"/>
+                <w:sz w:val="24"/>
+                <w:szCs w:val="24"/>
+                <w:u w:val="none"/>
+              </w:rPr>
+              <w:t>createChain</w:t>
+            </w:r>
+          </w:p>
+        </w:tc>
+        <w:tc>
+          <w:tcPr>
+            <w:tcW w:w="1937" w:type="dxa"/>
             <w:tcBorders>
               <w:start w:val="single" w:sz="4" w:space="0" w:color="000000"/>
               <w:bottom w:val="single" w:sz="4" w:space="0" w:color="000000"/>
@@ -487,7 +470,7 @@
                 <w:szCs w:val="24"/>
                 <w:u w:val="none"/>
               </w:rPr>
-              <w:t>All CHAIN fields</w:t>
+              <w:t>createChainDto</w:t>
             </w:r>
           </w:p>
         </w:tc>
@@ -546,73 +529,56 @@
         <w:trPr/>
         <w:tc>
           <w:tcPr>
-            <w:tcW w:w="1919" w:type="dxa"/>
-            <w:tcBorders>
-              <w:start w:val="single" w:sz="4" w:space="0" w:color="000000"/>
-              <w:bottom w:val="single" w:sz="4" w:space="0" w:color="000000"/>
-            </w:tcBorders>
-          </w:tcPr>
-          <w:p>
-            <w:pPr>
-              <w:pStyle w:val="TableContents"/>
-              <w:bidi w:val="0"/>
-              <w:jc w:val="start"/>
-              <w:rPr>
-                <w:rFonts w:ascii="Liberation Serif" w:hAnsi="Liberation Serif"/>
-                <w:b w:val="false"/>
-                <w:bCs w:val="false"/>
-                <w:i w:val="false"/>
-                <w:i w:val="false"/>
-                <w:iCs w:val="false"/>
-                <w:strike w:val="false"/>
-                <w:dstrike w:val="false"/>
-                <w:outline w:val="false"/>
-                <w:shadow w:val="false"/>
-                <w:color w:val="000000"/>
-                <w:sz w:val="24"/>
-                <w:szCs w:val="24"/>
-                <w:u w:val="none"/>
-              </w:rPr>
-            </w:pPr>
-            <w:r>
-              <w:rPr>
-                <w:b w:val="false"/>
-                <w:bCs w:val="false"/>
-                <w:i w:val="false"/>
-                <w:iCs w:val="false"/>
-                <w:strike w:val="false"/>
-                <w:dstrike w:val="false"/>
-                <w:outline w:val="false"/>
-                <w:shadow w:val="false"/>
-                <w:color w:val="000000"/>
-                <w:sz w:val="24"/>
-                <w:szCs w:val="24"/>
-                <w:u w:val="none"/>
-              </w:rPr>
-              <w:t>u</w:t>
-            </w:r>
-            <w:r>
-              <w:rPr>
-                <w:b w:val="false"/>
-                <w:bCs w:val="false"/>
-                <w:i w:val="false"/>
-                <w:iCs w:val="false"/>
-                <w:strike w:val="false"/>
-                <w:dstrike w:val="false"/>
-                <w:outline w:val="false"/>
-                <w:shadow w:val="false"/>
-                <w:color w:val="000000"/>
-                <w:sz w:val="24"/>
-                <w:szCs w:val="24"/>
-                <w:u w:val="none"/>
-              </w:rPr>
-              <w:t>pdateChainName</w:t>
-            </w:r>
-          </w:p>
-        </w:tc>
-        <w:tc>
-          <w:tcPr>
-            <w:tcW w:w="1936" w:type="dxa"/>
+            <w:tcW w:w="1918" w:type="dxa"/>
+            <w:tcBorders>
+              <w:start w:val="single" w:sz="4" w:space="0" w:color="000000"/>
+              <w:bottom w:val="single" w:sz="4" w:space="0" w:color="000000"/>
+            </w:tcBorders>
+          </w:tcPr>
+          <w:p>
+            <w:pPr>
+              <w:pStyle w:val="TableContents"/>
+              <w:bidi w:val="0"/>
+              <w:jc w:val="start"/>
+              <w:rPr>
+                <w:rFonts w:ascii="Liberation Serif" w:hAnsi="Liberation Serif"/>
+                <w:b w:val="false"/>
+                <w:bCs w:val="false"/>
+                <w:i w:val="false"/>
+                <w:i w:val="false"/>
+                <w:iCs w:val="false"/>
+                <w:strike w:val="false"/>
+                <w:dstrike w:val="false"/>
+                <w:outline w:val="false"/>
+                <w:shadow w:val="false"/>
+                <w:color w:val="000000"/>
+                <w:sz w:val="24"/>
+                <w:szCs w:val="24"/>
+                <w:u w:val="none"/>
+              </w:rPr>
+            </w:pPr>
+            <w:r>
+              <w:rPr>
+                <w:b w:val="false"/>
+                <w:bCs w:val="false"/>
+                <w:i w:val="false"/>
+                <w:iCs w:val="false"/>
+                <w:strike w:val="false"/>
+                <w:dstrike w:val="false"/>
+                <w:outline w:val="false"/>
+                <w:shadow w:val="false"/>
+                <w:color w:val="000000"/>
+                <w:sz w:val="24"/>
+                <w:szCs w:val="24"/>
+                <w:u w:val="none"/>
+              </w:rPr>
+              <w:t>updateChainName</w:t>
+            </w:r>
+          </w:p>
+        </w:tc>
+        <w:tc>
+          <w:tcPr>
+            <w:tcW w:w="1937" w:type="dxa"/>
             <w:tcBorders>
               <w:start w:val="single" w:sz="4" w:space="0" w:color="000000"/>
               <w:bottom w:val="single" w:sz="4" w:space="0" w:color="000000"/>
@@ -753,7 +719,7 @@
                 <w:szCs w:val="24"/>
                 <w:u w:val="none"/>
               </w:rPr>
-              <w:t>chain_name</w:t>
+              <w:t>chainId, updateChainNameDto</w:t>
             </w:r>
           </w:p>
         </w:tc>
@@ -812,73 +778,56 @@
         <w:trPr/>
         <w:tc>
           <w:tcPr>
-            <w:tcW w:w="1919" w:type="dxa"/>
-            <w:tcBorders>
-              <w:start w:val="single" w:sz="4" w:space="0" w:color="000000"/>
-              <w:bottom w:val="single" w:sz="4" w:space="0" w:color="000000"/>
-            </w:tcBorders>
-          </w:tcPr>
-          <w:p>
-            <w:pPr>
-              <w:pStyle w:val="TableContents"/>
-              <w:bidi w:val="0"/>
-              <w:jc w:val="start"/>
-              <w:rPr>
-                <w:rFonts w:ascii="Liberation Serif" w:hAnsi="Liberation Serif"/>
-                <w:b w:val="false"/>
-                <w:bCs w:val="false"/>
-                <w:i w:val="false"/>
-                <w:i w:val="false"/>
-                <w:iCs w:val="false"/>
-                <w:strike w:val="false"/>
-                <w:dstrike w:val="false"/>
-                <w:outline w:val="false"/>
-                <w:shadow w:val="false"/>
-                <w:color w:val="000000"/>
-                <w:sz w:val="24"/>
-                <w:szCs w:val="24"/>
-                <w:u w:val="none"/>
-              </w:rPr>
-            </w:pPr>
-            <w:r>
-              <w:rPr>
-                <w:b w:val="false"/>
-                <w:bCs w:val="false"/>
-                <w:i w:val="false"/>
-                <w:iCs w:val="false"/>
-                <w:strike w:val="false"/>
-                <w:dstrike w:val="false"/>
-                <w:outline w:val="false"/>
-                <w:shadow w:val="false"/>
-                <w:color w:val="000000"/>
-                <w:sz w:val="24"/>
-                <w:szCs w:val="24"/>
-                <w:u w:val="none"/>
-              </w:rPr>
-              <w:t>u</w:t>
-            </w:r>
-            <w:r>
-              <w:rPr>
-                <w:b w:val="false"/>
-                <w:bCs w:val="false"/>
-                <w:i w:val="false"/>
-                <w:iCs w:val="false"/>
-                <w:strike w:val="false"/>
-                <w:dstrike w:val="false"/>
-                <w:outline w:val="false"/>
-                <w:shadow w:val="false"/>
-                <w:color w:val="000000"/>
-                <w:sz w:val="24"/>
-                <w:szCs w:val="24"/>
-                <w:u w:val="none"/>
-              </w:rPr>
-              <w:t>pdateChainAddress</w:t>
-            </w:r>
-          </w:p>
-        </w:tc>
-        <w:tc>
-          <w:tcPr>
-            <w:tcW w:w="1936" w:type="dxa"/>
+            <w:tcW w:w="1918" w:type="dxa"/>
+            <w:tcBorders>
+              <w:start w:val="single" w:sz="4" w:space="0" w:color="000000"/>
+              <w:bottom w:val="single" w:sz="4" w:space="0" w:color="000000"/>
+            </w:tcBorders>
+          </w:tcPr>
+          <w:p>
+            <w:pPr>
+              <w:pStyle w:val="TableContents"/>
+              <w:bidi w:val="0"/>
+              <w:jc w:val="start"/>
+              <w:rPr>
+                <w:rFonts w:ascii="Liberation Serif" w:hAnsi="Liberation Serif"/>
+                <w:b w:val="false"/>
+                <w:bCs w:val="false"/>
+                <w:i w:val="false"/>
+                <w:i w:val="false"/>
+                <w:iCs w:val="false"/>
+                <w:strike w:val="false"/>
+                <w:dstrike w:val="false"/>
+                <w:outline w:val="false"/>
+                <w:shadow w:val="false"/>
+                <w:color w:val="000000"/>
+                <w:sz w:val="24"/>
+                <w:szCs w:val="24"/>
+                <w:u w:val="none"/>
+              </w:rPr>
+            </w:pPr>
+            <w:r>
+              <w:rPr>
+                <w:b w:val="false"/>
+                <w:bCs w:val="false"/>
+                <w:i w:val="false"/>
+                <w:iCs w:val="false"/>
+                <w:strike w:val="false"/>
+                <w:dstrike w:val="false"/>
+                <w:outline w:val="false"/>
+                <w:shadow w:val="false"/>
+                <w:color w:val="000000"/>
+                <w:sz w:val="24"/>
+                <w:szCs w:val="24"/>
+                <w:u w:val="none"/>
+              </w:rPr>
+              <w:t>updateChainAddress</w:t>
+            </w:r>
+          </w:p>
+        </w:tc>
+        <w:tc>
+          <w:tcPr>
+            <w:tcW w:w="1937" w:type="dxa"/>
             <w:tcBorders>
               <w:start w:val="single" w:sz="4" w:space="0" w:color="000000"/>
               <w:bottom w:val="single" w:sz="4" w:space="0" w:color="000000"/>
@@ -1019,7 +968,7 @@
                 <w:szCs w:val="24"/>
                 <w:u w:val="none"/>
               </w:rPr>
-              <w:t>One or more chain_address_* fields.</w:t>
+              <w:t>chainId, updateChainAddressDto</w:t>
             </w:r>
           </w:p>
         </w:tc>
@@ -1078,7 +1027,7 @@
         <w:trPr/>
         <w:tc>
           <w:tcPr>
-            <w:tcW w:w="1919" w:type="dxa"/>
+            <w:tcW w:w="1918" w:type="dxa"/>
             <w:tcBorders>
               <w:start w:val="single" w:sz="4" w:space="0" w:color="000000"/>
               <w:bottom w:val="single" w:sz="4" w:space="0" w:color="000000"/>
@@ -1127,7 +1076,7 @@
         </w:tc>
         <w:tc>
           <w:tcPr>
-            <w:tcW w:w="1936" w:type="dxa"/>
+            <w:tcW w:w="1937" w:type="dxa"/>
             <w:tcBorders>
               <w:start w:val="single" w:sz="4" w:space="0" w:color="000000"/>
               <w:bottom w:val="single" w:sz="4" w:space="0" w:color="000000"/>
@@ -1268,7 +1217,7 @@
                 <w:szCs w:val="24"/>
                 <w:u w:val="none"/>
               </w:rPr>
-              <w:t>chain_id</w:t>
+              <w:t>id</w:t>
             </w:r>
           </w:p>
         </w:tc>
@@ -1327,7 +1276,7 @@
         <w:trPr/>
         <w:tc>
           <w:tcPr>
-            <w:tcW w:w="1919" w:type="dxa"/>
+            <w:tcW w:w="1918" w:type="dxa"/>
             <w:tcBorders>
               <w:start w:val="single" w:sz="4" w:space="0" w:color="000000"/>
               <w:bottom w:val="single" w:sz="4" w:space="0" w:color="000000"/>
@@ -1376,7 +1325,7 @@
         </w:tc>
         <w:tc>
           <w:tcPr>
-            <w:tcW w:w="1936" w:type="dxa"/>
+            <w:tcW w:w="1937" w:type="dxa"/>
             <w:tcBorders>
               <w:start w:val="single" w:sz="4" w:space="0" w:color="000000"/>
               <w:bottom w:val="single" w:sz="4" w:space="0" w:color="000000"/>
@@ -1576,73 +1525,56 @@
         <w:trPr/>
         <w:tc>
           <w:tcPr>
-            <w:tcW w:w="1919" w:type="dxa"/>
-            <w:tcBorders>
-              <w:start w:val="single" w:sz="4" w:space="0" w:color="000000"/>
-              <w:bottom w:val="single" w:sz="4" w:space="0" w:color="000000"/>
-            </w:tcBorders>
-          </w:tcPr>
-          <w:p>
-            <w:pPr>
-              <w:pStyle w:val="TableContents"/>
-              <w:bidi w:val="0"/>
-              <w:jc w:val="start"/>
-              <w:rPr>
-                <w:rFonts w:ascii="Liberation Serif" w:hAnsi="Liberation Serif"/>
-                <w:b w:val="false"/>
-                <w:bCs w:val="false"/>
-                <w:i w:val="false"/>
-                <w:i w:val="false"/>
-                <w:iCs w:val="false"/>
-                <w:strike w:val="false"/>
-                <w:dstrike w:val="false"/>
-                <w:outline w:val="false"/>
-                <w:shadow w:val="false"/>
-                <w:color w:val="000000"/>
-                <w:sz w:val="24"/>
-                <w:szCs w:val="24"/>
-                <w:u w:val="none"/>
-              </w:rPr>
-            </w:pPr>
-            <w:r>
-              <w:rPr>
-                <w:b w:val="false"/>
-                <w:bCs w:val="false"/>
-                <w:i w:val="false"/>
-                <w:iCs w:val="false"/>
-                <w:strike w:val="false"/>
-                <w:dstrike w:val="false"/>
-                <w:outline w:val="false"/>
-                <w:shadow w:val="false"/>
-                <w:color w:val="000000"/>
-                <w:sz w:val="24"/>
-                <w:szCs w:val="24"/>
-                <w:u w:val="none"/>
-              </w:rPr>
-              <w:t>s</w:t>
-            </w:r>
-            <w:r>
-              <w:rPr>
-                <w:b w:val="false"/>
-                <w:bCs w:val="false"/>
-                <w:i w:val="false"/>
-                <w:iCs w:val="false"/>
-                <w:strike w:val="false"/>
-                <w:dstrike w:val="false"/>
-                <w:outline w:val="false"/>
-                <w:shadow w:val="false"/>
-                <w:color w:val="000000"/>
-                <w:sz w:val="24"/>
-                <w:szCs w:val="24"/>
-                <w:u w:val="none"/>
-              </w:rPr>
-              <w:t>earchChainsByName</w:t>
-            </w:r>
-          </w:p>
-        </w:tc>
-        <w:tc>
-          <w:tcPr>
-            <w:tcW w:w="1936" w:type="dxa"/>
+            <w:tcW w:w="1918" w:type="dxa"/>
+            <w:tcBorders>
+              <w:start w:val="single" w:sz="4" w:space="0" w:color="000000"/>
+              <w:bottom w:val="single" w:sz="4" w:space="0" w:color="000000"/>
+            </w:tcBorders>
+          </w:tcPr>
+          <w:p>
+            <w:pPr>
+              <w:pStyle w:val="TableContents"/>
+              <w:bidi w:val="0"/>
+              <w:jc w:val="start"/>
+              <w:rPr>
+                <w:rFonts w:ascii="Liberation Serif" w:hAnsi="Liberation Serif"/>
+                <w:b w:val="false"/>
+                <w:bCs w:val="false"/>
+                <w:i w:val="false"/>
+                <w:i w:val="false"/>
+                <w:iCs w:val="false"/>
+                <w:strike w:val="false"/>
+                <w:dstrike w:val="false"/>
+                <w:outline w:val="false"/>
+                <w:shadow w:val="false"/>
+                <w:color w:val="000000"/>
+                <w:sz w:val="24"/>
+                <w:szCs w:val="24"/>
+                <w:u w:val="none"/>
+              </w:rPr>
+            </w:pPr>
+            <w:r>
+              <w:rPr>
+                <w:b w:val="false"/>
+                <w:bCs w:val="false"/>
+                <w:i w:val="false"/>
+                <w:iCs w:val="false"/>
+                <w:strike w:val="false"/>
+                <w:dstrike w:val="false"/>
+                <w:outline w:val="false"/>
+                <w:shadow w:val="false"/>
+                <w:color w:val="000000"/>
+                <w:sz w:val="24"/>
+                <w:szCs w:val="24"/>
+                <w:u w:val="none"/>
+              </w:rPr>
+              <w:t>searchChainsByName</w:t>
+            </w:r>
+          </w:p>
+        </w:tc>
+        <w:tc>
+          <w:tcPr>
+            <w:tcW w:w="1937" w:type="dxa"/>
             <w:tcBorders>
               <w:start w:val="single" w:sz="4" w:space="0" w:color="000000"/>
               <w:bottom w:val="single" w:sz="4" w:space="0" w:color="000000"/>
@@ -1842,116 +1774,133 @@
         <w:trPr/>
         <w:tc>
           <w:tcPr>
-            <w:tcW w:w="1919" w:type="dxa"/>
-            <w:tcBorders>
-              <w:start w:val="single" w:sz="4" w:space="0" w:color="000000"/>
-              <w:bottom w:val="single" w:sz="4" w:space="0" w:color="000000"/>
-            </w:tcBorders>
-          </w:tcPr>
-          <w:p>
-            <w:pPr>
-              <w:pStyle w:val="TableContents"/>
-              <w:bidi w:val="0"/>
-              <w:jc w:val="start"/>
-              <w:rPr>
-                <w:rFonts w:ascii="Liberation Serif" w:hAnsi="Liberation Serif"/>
-                <w:b w:val="false"/>
-                <w:bCs w:val="false"/>
-                <w:i w:val="false"/>
-                <w:i w:val="false"/>
-                <w:iCs w:val="false"/>
-                <w:strike w:val="false"/>
-                <w:dstrike w:val="false"/>
-                <w:outline w:val="false"/>
-                <w:shadow w:val="false"/>
-                <w:color w:val="000000"/>
-                <w:sz w:val="24"/>
-                <w:szCs w:val="24"/>
-                <w:u w:val="none"/>
-              </w:rPr>
-            </w:pPr>
-            <w:r>
-              <w:rPr>
-                <w:b w:val="false"/>
-                <w:bCs w:val="false"/>
-                <w:i w:val="false"/>
-                <w:iCs w:val="false"/>
-                <w:strike w:val="false"/>
-                <w:dstrike w:val="false"/>
-                <w:outline w:val="false"/>
-                <w:shadow w:val="false"/>
-                <w:color w:val="000000"/>
-                <w:sz w:val="24"/>
-                <w:szCs w:val="24"/>
-                <w:u w:val="none"/>
-              </w:rPr>
-              <w:t>d</w:t>
-            </w:r>
-            <w:r>
-              <w:rPr>
-                <w:b w:val="false"/>
-                <w:bCs w:val="false"/>
-                <w:i w:val="false"/>
-                <w:iCs w:val="false"/>
-                <w:strike w:val="false"/>
-                <w:dstrike w:val="false"/>
-                <w:outline w:val="false"/>
-                <w:shadow w:val="false"/>
-                <w:color w:val="000000"/>
-                <w:sz w:val="24"/>
-                <w:szCs w:val="24"/>
-                <w:u w:val="none"/>
-              </w:rPr>
-              <w:t>eleteChainByName</w:t>
-            </w:r>
-          </w:p>
-        </w:tc>
-        <w:tc>
-          <w:tcPr>
-            <w:tcW w:w="1936" w:type="dxa"/>
-            <w:tcBorders>
-              <w:start w:val="single" w:sz="4" w:space="0" w:color="000000"/>
-              <w:bottom w:val="single" w:sz="4" w:space="0" w:color="000000"/>
-            </w:tcBorders>
-          </w:tcPr>
-          <w:p>
-            <w:pPr>
-              <w:pStyle w:val="TableContents"/>
-              <w:bidi w:val="0"/>
-              <w:jc w:val="start"/>
-              <w:rPr>
-                <w:rFonts w:ascii="Liberation Serif" w:hAnsi="Liberation Serif"/>
-                <w:b w:val="false"/>
-                <w:bCs w:val="false"/>
-                <w:i w:val="false"/>
-                <w:i w:val="false"/>
-                <w:iCs w:val="false"/>
-                <w:strike w:val="false"/>
-                <w:dstrike w:val="false"/>
-                <w:outline w:val="false"/>
-                <w:shadow w:val="false"/>
-                <w:color w:val="000000"/>
-                <w:sz w:val="24"/>
-                <w:szCs w:val="24"/>
-                <w:u w:val="none"/>
-              </w:rPr>
-            </w:pPr>
-            <w:r>
-              <w:rPr>
-                <w:b w:val="false"/>
-                <w:bCs w:val="false"/>
-                <w:i w:val="false"/>
-                <w:iCs w:val="false"/>
-                <w:strike w:val="false"/>
-                <w:dstrike w:val="false"/>
-                <w:outline w:val="false"/>
-                <w:shadow w:val="false"/>
-                <w:color w:val="000000"/>
-                <w:sz w:val="24"/>
-                <w:szCs w:val="24"/>
-                <w:u w:val="none"/>
-              </w:rPr>
-              <w:t>Delete a CHAIN using chain_name.</w:t>
+            <w:tcW w:w="1918" w:type="dxa"/>
+            <w:tcBorders>
+              <w:start w:val="single" w:sz="4" w:space="0" w:color="000000"/>
+              <w:bottom w:val="single" w:sz="4" w:space="0" w:color="000000"/>
+            </w:tcBorders>
+          </w:tcPr>
+          <w:p>
+            <w:pPr>
+              <w:pStyle w:val="TableContents"/>
+              <w:bidi w:val="0"/>
+              <w:jc w:val="start"/>
+              <w:rPr>
+                <w:rFonts w:ascii="Liberation Serif" w:hAnsi="Liberation Serif"/>
+                <w:b w:val="false"/>
+                <w:bCs w:val="false"/>
+                <w:i w:val="false"/>
+                <w:i w:val="false"/>
+                <w:iCs w:val="false"/>
+                <w:strike w:val="false"/>
+                <w:dstrike w:val="false"/>
+                <w:outline w:val="false"/>
+                <w:shadow w:val="false"/>
+                <w:color w:val="000000"/>
+                <w:sz w:val="24"/>
+                <w:szCs w:val="24"/>
+                <w:u w:val="none"/>
+              </w:rPr>
+            </w:pPr>
+            <w:r>
+              <w:rPr>
+                <w:b w:val="false"/>
+                <w:bCs w:val="false"/>
+                <w:i w:val="false"/>
+                <w:iCs w:val="false"/>
+                <w:strike w:val="false"/>
+                <w:dstrike w:val="false"/>
+                <w:outline w:val="false"/>
+                <w:shadow w:val="false"/>
+                <w:color w:val="000000"/>
+                <w:sz w:val="24"/>
+                <w:szCs w:val="24"/>
+                <w:u w:val="none"/>
+              </w:rPr>
+              <w:t>removeChain</w:t>
+            </w:r>
+          </w:p>
+        </w:tc>
+        <w:tc>
+          <w:tcPr>
+            <w:tcW w:w="1937" w:type="dxa"/>
+            <w:tcBorders>
+              <w:start w:val="single" w:sz="4" w:space="0" w:color="000000"/>
+              <w:bottom w:val="single" w:sz="4" w:space="0" w:color="000000"/>
+            </w:tcBorders>
+          </w:tcPr>
+          <w:p>
+            <w:pPr>
+              <w:pStyle w:val="TableContents"/>
+              <w:bidi w:val="0"/>
+              <w:jc w:val="start"/>
+              <w:rPr>
+                <w:rFonts w:ascii="Liberation Serif" w:hAnsi="Liberation Serif"/>
+                <w:b w:val="false"/>
+                <w:bCs w:val="false"/>
+                <w:i w:val="false"/>
+                <w:i w:val="false"/>
+                <w:iCs w:val="false"/>
+                <w:strike w:val="false"/>
+                <w:dstrike w:val="false"/>
+                <w:outline w:val="false"/>
+                <w:shadow w:val="false"/>
+                <w:color w:val="000000"/>
+                <w:sz w:val="24"/>
+                <w:szCs w:val="24"/>
+                <w:u w:val="none"/>
+              </w:rPr>
+            </w:pPr>
+            <w:r>
+              <w:rPr>
+                <w:b w:val="false"/>
+                <w:bCs w:val="false"/>
+                <w:i w:val="false"/>
+                <w:iCs w:val="false"/>
+                <w:strike w:val="false"/>
+                <w:dstrike w:val="false"/>
+                <w:outline w:val="false"/>
+                <w:shadow w:val="false"/>
+                <w:color w:val="000000"/>
+                <w:sz w:val="24"/>
+                <w:szCs w:val="24"/>
+                <w:u w:val="none"/>
+              </w:rPr>
+              <w:t>Delete a CHAIN using chain_</w:t>
+            </w:r>
+            <w:r>
+              <w:rPr>
+                <w:b w:val="false"/>
+                <w:bCs w:val="false"/>
+                <w:i w:val="false"/>
+                <w:iCs w:val="false"/>
+                <w:strike w:val="false"/>
+                <w:dstrike w:val="false"/>
+                <w:outline w:val="false"/>
+                <w:shadow w:val="false"/>
+                <w:color w:val="000000"/>
+                <w:sz w:val="24"/>
+                <w:szCs w:val="24"/>
+                <w:u w:val="none"/>
+              </w:rPr>
+              <w:t>id</w:t>
+            </w:r>
+            <w:r>
+              <w:rPr>
+                <w:b w:val="false"/>
+                <w:bCs w:val="false"/>
+                <w:i w:val="false"/>
+                <w:iCs w:val="false"/>
+                <w:strike w:val="false"/>
+                <w:dstrike w:val="false"/>
+                <w:outline w:val="false"/>
+                <w:shadow w:val="false"/>
+                <w:color w:val="000000"/>
+                <w:sz w:val="24"/>
+                <w:szCs w:val="24"/>
+                <w:u w:val="none"/>
+              </w:rPr>
+              <w:t>.</w:t>
             </w:r>
           </w:p>
         </w:tc>
@@ -2049,7 +1998,24 @@
                 <w:szCs w:val="24"/>
                 <w:u w:val="none"/>
               </w:rPr>
-              <w:t>chain_name</w:t>
+              <w:t>chain</w:t>
+            </w:r>
+            <w:r>
+              <w:rPr>
+                <w:b w:val="false"/>
+                <w:bCs w:val="false"/>
+                <w:i w:val="false"/>
+                <w:iCs w:val="false"/>
+                <w:strike w:val="false"/>
+                <w:dstrike w:val="false"/>
+                <w:outline w:val="false"/>
+                <w:shadow w:val="false"/>
+                <w:color w:val="000000"/>
+                <w:sz w:val="24"/>
+                <w:szCs w:val="24"/>
+                <w:u w:val="none"/>
+              </w:rPr>
+              <w:t>Id</w:t>
             </w:r>
           </w:p>
         </w:tc>
@@ -2321,7 +2287,10 @@
         </w:rPr>
       </w:pPr>
       <w:r>
-        <w:rPr/>
+        <w:rPr>
+          <w:b w:val="false"/>
+          <w:bCs w:val="false"/>
+        </w:rPr>
       </w:r>
     </w:p>
     <w:p>
@@ -2835,9 +2804,9 @@
         <w:jc w:val="start"/>
         <w:rPr/>
       </w:pPr>
-      <w:bookmarkStart w:id="7" w:name="__DdeLink__139_2312781727"/>
+      <w:bookmarkStart w:id="7" w:name="__DdeLink__296_1992960000"/>
       <w:bookmarkStart w:id="8" w:name="__DdeLink__142_2312781727"/>
-      <w:bookmarkStart w:id="9" w:name="__DdeLink__296_1992960000"/>
+      <w:bookmarkStart w:id="9" w:name="__DdeLink__139_2312781727"/>
       <w:r>
         <w:rPr/>
         <w:t>* Delete the CHAIN with chain_id 12.</w:t>
@@ -2967,8 +2936,8 @@
         <w:jc w:val="start"/>
         <w:rPr/>
       </w:pPr>
-      <w:bookmarkStart w:id="11" w:name="__DdeLink__136_2894387740"/>
-      <w:bookmarkStart w:id="12" w:name="__DdeLink__133_2894387740"/>
+      <w:bookmarkStart w:id="11" w:name="__DdeLink__133_2894387740"/>
+      <w:bookmarkStart w:id="12" w:name="__DdeLink__136_2894387740"/>
       <w:r>
         <w:rPr/>
         <w:t>NOTE: “Test Chain” has chain_ id = 4.</w:t>
@@ -3013,7 +2982,7 @@
     <w:pPr>
       <w:widowControl/>
       <w:suppressAutoHyphens w:val="true"/>
-      <w:overflowPunct w:val="false"/>
+      <w:overflowPunct w:val="true"/>
       <w:bidi w:val="0"/>
       <w:spacing w:before="0" w:after="0"/>
       <w:jc w:val="start"/>

</xml_diff>

<commit_message>
Added authorization conditions to all entity API design documents except User entity
</commit_message>
<xml_diff>
--- a/Portal_Database_Design/Chain_APIs.docx
+++ b/Portal_Database_Design/Chain_APIs.docx
@@ -16,17 +16,18 @@
         </w:tblCellMar>
       </w:tblPr>
       <w:tblGrid>
-        <w:gridCol w:w="1918"/>
-        <w:gridCol w:w="1937"/>
-        <w:gridCol w:w="1921"/>
-        <w:gridCol w:w="1934"/>
-        <w:gridCol w:w="1928"/>
+        <w:gridCol w:w="1598"/>
+        <w:gridCol w:w="1614"/>
+        <w:gridCol w:w="1601"/>
+        <w:gridCol w:w="1612"/>
+        <w:gridCol w:w="1606"/>
+        <w:gridCol w:w="1607"/>
       </w:tblGrid>
       <w:tr>
         <w:trPr/>
         <w:tc>
           <w:tcPr>
-            <w:tcW w:w="1918" w:type="dxa"/>
+            <w:tcW w:w="1598" w:type="dxa"/>
             <w:tcBorders>
               <w:top w:val="single" w:sz="4" w:space="0" w:color="000000"/>
               <w:start w:val="single" w:sz="4" w:space="0" w:color="000000"/>
@@ -76,7 +77,7 @@
         </w:tc>
         <w:tc>
           <w:tcPr>
-            <w:tcW w:w="1937" w:type="dxa"/>
+            <w:tcW w:w="1614" w:type="dxa"/>
             <w:tcBorders>
               <w:top w:val="single" w:sz="4" w:space="0" w:color="000000"/>
               <w:start w:val="single" w:sz="4" w:space="0" w:color="000000"/>
@@ -126,7 +127,7 @@
         </w:tc>
         <w:tc>
           <w:tcPr>
-            <w:tcW w:w="1921" w:type="dxa"/>
+            <w:tcW w:w="1601" w:type="dxa"/>
             <w:tcBorders>
               <w:top w:val="single" w:sz="4" w:space="0" w:color="000000"/>
               <w:start w:val="single" w:sz="4" w:space="0" w:color="000000"/>
@@ -176,7 +177,7 @@
         </w:tc>
         <w:tc>
           <w:tcPr>
-            <w:tcW w:w="1934" w:type="dxa"/>
+            <w:tcW w:w="1612" w:type="dxa"/>
             <w:tcBorders>
               <w:top w:val="single" w:sz="4" w:space="0" w:color="000000"/>
               <w:start w:val="single" w:sz="4" w:space="0" w:color="000000"/>
@@ -226,11 +227,61 @@
         </w:tc>
         <w:tc>
           <w:tcPr>
-            <w:tcW w:w="1928" w:type="dxa"/>
+            <w:tcW w:w="1606" w:type="dxa"/>
             <w:tcBorders>
               <w:top w:val="single" w:sz="4" w:space="0" w:color="000000"/>
               <w:start w:val="single" w:sz="4" w:space="0" w:color="000000"/>
               <w:bottom w:val="single" w:sz="4" w:space="0" w:color="000000"/>
+            </w:tcBorders>
+          </w:tcPr>
+          <w:p>
+            <w:pPr>
+              <w:pStyle w:val="TableContents"/>
+              <w:bidi w:val="0"/>
+              <w:jc w:val="start"/>
+              <w:rPr>
+                <w:rFonts w:ascii="Liberation Serif" w:hAnsi="Liberation Serif"/>
+                <w:b w:val="false"/>
+                <w:bCs w:val="false"/>
+                <w:i w:val="false"/>
+                <w:i w:val="false"/>
+                <w:iCs w:val="false"/>
+                <w:strike w:val="false"/>
+                <w:dstrike w:val="false"/>
+                <w:outline w:val="false"/>
+                <w:shadow w:val="false"/>
+                <w:color w:val="000000"/>
+                <w:sz w:val="24"/>
+                <w:szCs w:val="24"/>
+                <w:u w:val="none"/>
+              </w:rPr>
+            </w:pPr>
+            <w:r>
+              <w:rPr>
+                <w:b w:val="false"/>
+                <w:bCs w:val="false"/>
+                <w:i w:val="false"/>
+                <w:iCs w:val="false"/>
+                <w:strike w:val="false"/>
+                <w:dstrike w:val="false"/>
+                <w:outline w:val="false"/>
+                <w:shadow w:val="false"/>
+                <w:color w:val="000000"/>
+                <w:sz w:val="24"/>
+                <w:szCs w:val="24"/>
+                <w:u w:val="none"/>
+              </w:rPr>
+              <w:t>Data Output</w:t>
+            </w:r>
+          </w:p>
+        </w:tc>
+        <w:tc>
+          <w:tcPr>
+            <w:tcW w:w="1607" w:type="dxa"/>
+            <w:tcBorders>
+              <w:top w:val="single" w:sz="4" w:space="0" w:color="000000"/>
+              <w:start w:val="single" w:sz="4" w:space="0" w:color="000000"/>
+              <w:bottom w:val="single" w:sz="4" w:space="0" w:color="000000"/>
               <w:end w:val="single" w:sz="4" w:space="0" w:color="000000"/>
             </w:tcBorders>
           </w:tcPr>
@@ -271,7 +322,7 @@
                 <w:szCs w:val="24"/>
                 <w:u w:val="none"/>
               </w:rPr>
-              <w:t>Data Output</w:t>
+              <w:t>Authorization</w:t>
             </w:r>
           </w:p>
         </w:tc>
@@ -280,7 +331,7 @@
         <w:trPr/>
         <w:tc>
           <w:tcPr>
-            <w:tcW w:w="1918" w:type="dxa"/>
+            <w:tcW w:w="1598" w:type="dxa"/>
             <w:tcBorders>
               <w:start w:val="single" w:sz="4" w:space="0" w:color="000000"/>
               <w:bottom w:val="single" w:sz="4" w:space="0" w:color="000000"/>
@@ -329,7 +380,7 @@
         </w:tc>
         <w:tc>
           <w:tcPr>
-            <w:tcW w:w="1937" w:type="dxa"/>
+            <w:tcW w:w="1614" w:type="dxa"/>
             <w:tcBorders>
               <w:start w:val="single" w:sz="4" w:space="0" w:color="000000"/>
               <w:bottom w:val="single" w:sz="4" w:space="0" w:color="000000"/>
@@ -378,7 +429,7 @@
         </w:tc>
         <w:tc>
           <w:tcPr>
-            <w:tcW w:w="1921" w:type="dxa"/>
+            <w:tcW w:w="1601" w:type="dxa"/>
             <w:tcBorders>
               <w:start w:val="single" w:sz="4" w:space="0" w:color="000000"/>
               <w:bottom w:val="single" w:sz="4" w:space="0" w:color="000000"/>
@@ -427,7 +478,7 @@
         </w:tc>
         <w:tc>
           <w:tcPr>
-            <w:tcW w:w="1934" w:type="dxa"/>
+            <w:tcW w:w="1612" w:type="dxa"/>
             <w:tcBorders>
               <w:start w:val="single" w:sz="4" w:space="0" w:color="000000"/>
               <w:bottom w:val="single" w:sz="4" w:space="0" w:color="000000"/>
@@ -476,7 +527,56 @@
         </w:tc>
         <w:tc>
           <w:tcPr>
-            <w:tcW w:w="1928" w:type="dxa"/>
+            <w:tcW w:w="1606" w:type="dxa"/>
+            <w:tcBorders>
+              <w:start w:val="single" w:sz="4" w:space="0" w:color="000000"/>
+              <w:bottom w:val="single" w:sz="4" w:space="0" w:color="000000"/>
+            </w:tcBorders>
+          </w:tcPr>
+          <w:p>
+            <w:pPr>
+              <w:pStyle w:val="TableContents"/>
+              <w:bidi w:val="0"/>
+              <w:jc w:val="start"/>
+              <w:rPr>
+                <w:rFonts w:ascii="Liberation Serif" w:hAnsi="Liberation Serif"/>
+                <w:b w:val="false"/>
+                <w:bCs w:val="false"/>
+                <w:i w:val="false"/>
+                <w:i w:val="false"/>
+                <w:iCs w:val="false"/>
+                <w:strike w:val="false"/>
+                <w:dstrike w:val="false"/>
+                <w:outline w:val="false"/>
+                <w:shadow w:val="false"/>
+                <w:color w:val="000000"/>
+                <w:sz w:val="24"/>
+                <w:szCs w:val="24"/>
+                <w:u w:val="none"/>
+              </w:rPr>
+            </w:pPr>
+            <w:r>
+              <w:rPr>
+                <w:b w:val="false"/>
+                <w:bCs w:val="false"/>
+                <w:i w:val="false"/>
+                <w:iCs w:val="false"/>
+                <w:strike w:val="false"/>
+                <w:dstrike w:val="false"/>
+                <w:outline w:val="false"/>
+                <w:shadow w:val="false"/>
+                <w:color w:val="000000"/>
+                <w:sz w:val="24"/>
+                <w:szCs w:val="24"/>
+                <w:u w:val="none"/>
+              </w:rPr>
+              <w:t>CHAIN record.</w:t>
+            </w:r>
+          </w:p>
+        </w:tc>
+        <w:tc>
+          <w:tcPr>
+            <w:tcW w:w="1607" w:type="dxa"/>
             <w:tcBorders>
               <w:start w:val="single" w:sz="4" w:space="0" w:color="000000"/>
               <w:bottom w:val="single" w:sz="4" w:space="0" w:color="000000"/>
@@ -520,8 +620,27 @@
                 <w:szCs w:val="24"/>
                 <w:u w:val="none"/>
               </w:rPr>
-              <w:t>CHAIN record.</w:t>
-            </w:r>
+              <w:t xml:space="preserve">A chain can only be created by a company_manager. </w:t>
+            </w:r>
+            <w:bookmarkStart w:id="0" w:name="__DdeLink__195_1060888073"/>
+            <w:r>
+              <w:rPr>
+                <w:b w:val="false"/>
+                <w:bCs w:val="false"/>
+                <w:i w:val="false"/>
+                <w:iCs w:val="false"/>
+                <w:strike w:val="false"/>
+                <w:dstrike w:val="false"/>
+                <w:outline w:val="false"/>
+                <w:shadow w:val="false"/>
+                <w:color w:val="000000"/>
+                <w:sz w:val="24"/>
+                <w:szCs w:val="24"/>
+                <w:u w:val="none"/>
+              </w:rPr>
+              <w:t>The logged_in user’s user_role should be checked.</w:t>
+            </w:r>
+            <w:bookmarkEnd w:id="0"/>
           </w:p>
         </w:tc>
       </w:tr>
@@ -529,7 +648,7 @@
         <w:trPr/>
         <w:tc>
           <w:tcPr>
-            <w:tcW w:w="1918" w:type="dxa"/>
+            <w:tcW w:w="1598" w:type="dxa"/>
             <w:tcBorders>
               <w:start w:val="single" w:sz="4" w:space="0" w:color="000000"/>
               <w:bottom w:val="single" w:sz="4" w:space="0" w:color="000000"/>
@@ -578,7 +697,7 @@
         </w:tc>
         <w:tc>
           <w:tcPr>
-            <w:tcW w:w="1937" w:type="dxa"/>
+            <w:tcW w:w="1614" w:type="dxa"/>
             <w:tcBorders>
               <w:start w:val="single" w:sz="4" w:space="0" w:color="000000"/>
               <w:bottom w:val="single" w:sz="4" w:space="0" w:color="000000"/>
@@ -627,7 +746,7 @@
         </w:tc>
         <w:tc>
           <w:tcPr>
-            <w:tcW w:w="1921" w:type="dxa"/>
+            <w:tcW w:w="1601" w:type="dxa"/>
             <w:tcBorders>
               <w:start w:val="single" w:sz="4" w:space="0" w:color="000000"/>
               <w:bottom w:val="single" w:sz="4" w:space="0" w:color="000000"/>
@@ -676,7 +795,7 @@
         </w:tc>
         <w:tc>
           <w:tcPr>
-            <w:tcW w:w="1934" w:type="dxa"/>
+            <w:tcW w:w="1612" w:type="dxa"/>
             <w:tcBorders>
               <w:start w:val="single" w:sz="4" w:space="0" w:color="000000"/>
               <w:bottom w:val="single" w:sz="4" w:space="0" w:color="000000"/>
@@ -725,7 +844,56 @@
         </w:tc>
         <w:tc>
           <w:tcPr>
-            <w:tcW w:w="1928" w:type="dxa"/>
+            <w:tcW w:w="1606" w:type="dxa"/>
+            <w:tcBorders>
+              <w:start w:val="single" w:sz="4" w:space="0" w:color="000000"/>
+              <w:bottom w:val="single" w:sz="4" w:space="0" w:color="000000"/>
+            </w:tcBorders>
+          </w:tcPr>
+          <w:p>
+            <w:pPr>
+              <w:pStyle w:val="TableContents"/>
+              <w:bidi w:val="0"/>
+              <w:jc w:val="start"/>
+              <w:rPr>
+                <w:rFonts w:ascii="Liberation Serif" w:hAnsi="Liberation Serif"/>
+                <w:b w:val="false"/>
+                <w:bCs w:val="false"/>
+                <w:i w:val="false"/>
+                <w:i w:val="false"/>
+                <w:iCs w:val="false"/>
+                <w:strike w:val="false"/>
+                <w:dstrike w:val="false"/>
+                <w:outline w:val="false"/>
+                <w:shadow w:val="false"/>
+                <w:color w:val="000000"/>
+                <w:sz w:val="24"/>
+                <w:szCs w:val="24"/>
+                <w:u w:val="none"/>
+              </w:rPr>
+            </w:pPr>
+            <w:r>
+              <w:rPr>
+                <w:b w:val="false"/>
+                <w:bCs w:val="false"/>
+                <w:i w:val="false"/>
+                <w:iCs w:val="false"/>
+                <w:strike w:val="false"/>
+                <w:dstrike w:val="false"/>
+                <w:outline w:val="false"/>
+                <w:shadow w:val="false"/>
+                <w:color w:val="000000"/>
+                <w:sz w:val="24"/>
+                <w:szCs w:val="24"/>
+                <w:u w:val="none"/>
+              </w:rPr>
+              <w:t>Updated chain_name</w:t>
+            </w:r>
+          </w:p>
+        </w:tc>
+        <w:tc>
+          <w:tcPr>
+            <w:tcW w:w="1607" w:type="dxa"/>
             <w:tcBorders>
               <w:start w:val="single" w:sz="4" w:space="0" w:color="000000"/>
               <w:bottom w:val="single" w:sz="4" w:space="0" w:color="000000"/>
@@ -754,22 +922,41 @@
                 <w:u w:val="none"/>
               </w:rPr>
             </w:pPr>
-            <w:r>
-              <w:rPr>
-                <w:b w:val="false"/>
-                <w:bCs w:val="false"/>
-                <w:i w:val="false"/>
-                <w:iCs w:val="false"/>
-                <w:strike w:val="false"/>
-                <w:dstrike w:val="false"/>
-                <w:outline w:val="false"/>
-                <w:shadow w:val="false"/>
-                <w:color w:val="000000"/>
-                <w:sz w:val="24"/>
-                <w:szCs w:val="24"/>
-                <w:u w:val="none"/>
-              </w:rPr>
-              <w:t>Updated chain_name</w:t>
+            <w:bookmarkStart w:id="1" w:name="__DdeLink__193_1060888073"/>
+            <w:r>
+              <w:rPr>
+                <w:b w:val="false"/>
+                <w:bCs w:val="false"/>
+                <w:i w:val="false"/>
+                <w:iCs w:val="false"/>
+                <w:strike w:val="false"/>
+                <w:dstrike w:val="false"/>
+                <w:outline w:val="false"/>
+                <w:shadow w:val="false"/>
+                <w:color w:val="000000"/>
+                <w:sz w:val="24"/>
+                <w:szCs w:val="24"/>
+                <w:u w:val="none"/>
+              </w:rPr>
+              <w:t>A chain’s name can be updated only by a company_manager or a chain_manager.</w:t>
+            </w:r>
+            <w:bookmarkEnd w:id="1"/>
+            <w:r>
+              <w:rPr>
+                <w:b w:val="false"/>
+                <w:bCs w:val="false"/>
+                <w:i w:val="false"/>
+                <w:iCs w:val="false"/>
+                <w:strike w:val="false"/>
+                <w:dstrike w:val="false"/>
+                <w:outline w:val="false"/>
+                <w:shadow w:val="false"/>
+                <w:color w:val="000000"/>
+                <w:sz w:val="24"/>
+                <w:szCs w:val="24"/>
+                <w:u w:val="none"/>
+              </w:rPr>
+              <w:t xml:space="preserve"> The logged_in user’s user_role should be checked.</w:t>
             </w:r>
           </w:p>
         </w:tc>
@@ -778,7 +965,7 @@
         <w:trPr/>
         <w:tc>
           <w:tcPr>
-            <w:tcW w:w="1918" w:type="dxa"/>
+            <w:tcW w:w="1598" w:type="dxa"/>
             <w:tcBorders>
               <w:start w:val="single" w:sz="4" w:space="0" w:color="000000"/>
               <w:bottom w:val="single" w:sz="4" w:space="0" w:color="000000"/>
@@ -827,7 +1014,7 @@
         </w:tc>
         <w:tc>
           <w:tcPr>
-            <w:tcW w:w="1937" w:type="dxa"/>
+            <w:tcW w:w="1614" w:type="dxa"/>
             <w:tcBorders>
               <w:start w:val="single" w:sz="4" w:space="0" w:color="000000"/>
               <w:bottom w:val="single" w:sz="4" w:space="0" w:color="000000"/>
@@ -876,7 +1063,7 @@
         </w:tc>
         <w:tc>
           <w:tcPr>
-            <w:tcW w:w="1921" w:type="dxa"/>
+            <w:tcW w:w="1601" w:type="dxa"/>
             <w:tcBorders>
               <w:start w:val="single" w:sz="4" w:space="0" w:color="000000"/>
               <w:bottom w:val="single" w:sz="4" w:space="0" w:color="000000"/>
@@ -925,7 +1112,7 @@
         </w:tc>
         <w:tc>
           <w:tcPr>
-            <w:tcW w:w="1934" w:type="dxa"/>
+            <w:tcW w:w="1612" w:type="dxa"/>
             <w:tcBorders>
               <w:start w:val="single" w:sz="4" w:space="0" w:color="000000"/>
               <w:bottom w:val="single" w:sz="4" w:space="0" w:color="000000"/>
@@ -974,7 +1161,56 @@
         </w:tc>
         <w:tc>
           <w:tcPr>
-            <w:tcW w:w="1928" w:type="dxa"/>
+            <w:tcW w:w="1606" w:type="dxa"/>
+            <w:tcBorders>
+              <w:start w:val="single" w:sz="4" w:space="0" w:color="000000"/>
+              <w:bottom w:val="single" w:sz="4" w:space="0" w:color="000000"/>
+            </w:tcBorders>
+          </w:tcPr>
+          <w:p>
+            <w:pPr>
+              <w:pStyle w:val="TableContents"/>
+              <w:bidi w:val="0"/>
+              <w:jc w:val="start"/>
+              <w:rPr>
+                <w:rFonts w:ascii="Liberation Serif" w:hAnsi="Liberation Serif"/>
+                <w:b w:val="false"/>
+                <w:bCs w:val="false"/>
+                <w:i w:val="false"/>
+                <w:i w:val="false"/>
+                <w:iCs w:val="false"/>
+                <w:strike w:val="false"/>
+                <w:dstrike w:val="false"/>
+                <w:outline w:val="false"/>
+                <w:shadow w:val="false"/>
+                <w:color w:val="000000"/>
+                <w:sz w:val="24"/>
+                <w:szCs w:val="24"/>
+                <w:u w:val="none"/>
+              </w:rPr>
+            </w:pPr>
+            <w:r>
+              <w:rPr>
+                <w:b w:val="false"/>
+                <w:bCs w:val="false"/>
+                <w:i w:val="false"/>
+                <w:iCs w:val="false"/>
+                <w:strike w:val="false"/>
+                <w:dstrike w:val="false"/>
+                <w:outline w:val="false"/>
+                <w:shadow w:val="false"/>
+                <w:color w:val="000000"/>
+                <w:sz w:val="24"/>
+                <w:szCs w:val="24"/>
+                <w:u w:val="none"/>
+              </w:rPr>
+              <w:t>One or more updated values of chain_address_* fields.</w:t>
+            </w:r>
+          </w:p>
+        </w:tc>
+        <w:tc>
+          <w:tcPr>
+            <w:tcW w:w="1607" w:type="dxa"/>
             <w:tcBorders>
               <w:start w:val="single" w:sz="4" w:space="0" w:color="000000"/>
               <w:bottom w:val="single" w:sz="4" w:space="0" w:color="000000"/>
@@ -1018,8 +1254,27 @@
                 <w:szCs w:val="24"/>
                 <w:u w:val="none"/>
               </w:rPr>
-              <w:t>One or more updated values of chain_address_* fields.</w:t>
-            </w:r>
+              <w:t xml:space="preserve">A chain’s chain_address_* fields can be updated only by a company_manager or a chain_manager. </w:t>
+            </w:r>
+            <w:bookmarkStart w:id="2" w:name="__DdeLink__205_1060888073"/>
+            <w:r>
+              <w:rPr>
+                <w:b w:val="false"/>
+                <w:bCs w:val="false"/>
+                <w:i w:val="false"/>
+                <w:iCs w:val="false"/>
+                <w:strike w:val="false"/>
+                <w:dstrike w:val="false"/>
+                <w:outline w:val="false"/>
+                <w:shadow w:val="false"/>
+                <w:color w:val="000000"/>
+                <w:sz w:val="24"/>
+                <w:szCs w:val="24"/>
+                <w:u w:val="none"/>
+              </w:rPr>
+              <w:t>The logged_in user’s user_role should be checked.</w:t>
+            </w:r>
+            <w:bookmarkEnd w:id="2"/>
           </w:p>
         </w:tc>
       </w:tr>
@@ -1027,7 +1282,7 @@
         <w:trPr/>
         <w:tc>
           <w:tcPr>
-            <w:tcW w:w="1918" w:type="dxa"/>
+            <w:tcW w:w="1598" w:type="dxa"/>
             <w:tcBorders>
               <w:start w:val="single" w:sz="4" w:space="0" w:color="000000"/>
               <w:bottom w:val="single" w:sz="4" w:space="0" w:color="000000"/>
@@ -1076,7 +1331,7 @@
         </w:tc>
         <w:tc>
           <w:tcPr>
-            <w:tcW w:w="1937" w:type="dxa"/>
+            <w:tcW w:w="1614" w:type="dxa"/>
             <w:tcBorders>
               <w:start w:val="single" w:sz="4" w:space="0" w:color="000000"/>
               <w:bottom w:val="single" w:sz="4" w:space="0" w:color="000000"/>
@@ -1125,7 +1380,7 @@
         </w:tc>
         <w:tc>
           <w:tcPr>
-            <w:tcW w:w="1921" w:type="dxa"/>
+            <w:tcW w:w="1601" w:type="dxa"/>
             <w:tcBorders>
               <w:start w:val="single" w:sz="4" w:space="0" w:color="000000"/>
               <w:bottom w:val="single" w:sz="4" w:space="0" w:color="000000"/>
@@ -1174,7 +1429,7 @@
         </w:tc>
         <w:tc>
           <w:tcPr>
-            <w:tcW w:w="1934" w:type="dxa"/>
+            <w:tcW w:w="1612" w:type="dxa"/>
             <w:tcBorders>
               <w:start w:val="single" w:sz="4" w:space="0" w:color="000000"/>
               <w:bottom w:val="single" w:sz="4" w:space="0" w:color="000000"/>
@@ -1223,7 +1478,56 @@
         </w:tc>
         <w:tc>
           <w:tcPr>
-            <w:tcW w:w="1928" w:type="dxa"/>
+            <w:tcW w:w="1606" w:type="dxa"/>
+            <w:tcBorders>
+              <w:start w:val="single" w:sz="4" w:space="0" w:color="000000"/>
+              <w:bottom w:val="single" w:sz="4" w:space="0" w:color="000000"/>
+            </w:tcBorders>
+          </w:tcPr>
+          <w:p>
+            <w:pPr>
+              <w:pStyle w:val="TableContents"/>
+              <w:bidi w:val="0"/>
+              <w:jc w:val="start"/>
+              <w:rPr>
+                <w:rFonts w:ascii="Liberation Serif" w:hAnsi="Liberation Serif"/>
+                <w:b w:val="false"/>
+                <w:bCs w:val="false"/>
+                <w:i w:val="false"/>
+                <w:i w:val="false"/>
+                <w:iCs w:val="false"/>
+                <w:strike w:val="false"/>
+                <w:dstrike w:val="false"/>
+                <w:outline w:val="false"/>
+                <w:shadow w:val="false"/>
+                <w:color w:val="000000"/>
+                <w:sz w:val="24"/>
+                <w:szCs w:val="24"/>
+                <w:u w:val="none"/>
+              </w:rPr>
+            </w:pPr>
+            <w:r>
+              <w:rPr>
+                <w:b w:val="false"/>
+                <w:bCs w:val="false"/>
+                <w:i w:val="false"/>
+                <w:iCs w:val="false"/>
+                <w:strike w:val="false"/>
+                <w:dstrike w:val="false"/>
+                <w:outline w:val="false"/>
+                <w:shadow w:val="false"/>
+                <w:color w:val="000000"/>
+                <w:sz w:val="24"/>
+                <w:szCs w:val="24"/>
+                <w:u w:val="none"/>
+              </w:rPr>
+              <w:t>CHAIN record.</w:t>
+            </w:r>
+          </w:p>
+        </w:tc>
+        <w:tc>
+          <w:tcPr>
+            <w:tcW w:w="1607" w:type="dxa"/>
             <w:tcBorders>
               <w:start w:val="single" w:sz="4" w:space="0" w:color="000000"/>
               <w:bottom w:val="single" w:sz="4" w:space="0" w:color="000000"/>
@@ -1267,8 +1571,310 @@
                 <w:szCs w:val="24"/>
                 <w:u w:val="none"/>
               </w:rPr>
-              <w:t>CHAIN record.</w:t>
-            </w:r>
+              <w:t xml:space="preserve">Users of all user_roles can use findOneChain. </w:t>
+            </w:r>
+          </w:p>
+        </w:tc>
+      </w:tr>
+      <w:tr>
+        <w:trPr>
+          <w:trHeight w:val="2152" w:hRule="atLeast"/>
+        </w:trPr>
+        <w:tc>
+          <w:tcPr>
+            <w:tcW w:w="1598" w:type="dxa"/>
+            <w:tcBorders>
+              <w:start w:val="single" w:sz="4" w:space="0" w:color="000000"/>
+              <w:bottom w:val="single" w:sz="4" w:space="0" w:color="000000"/>
+            </w:tcBorders>
+          </w:tcPr>
+          <w:p>
+            <w:pPr>
+              <w:pStyle w:val="TableContents"/>
+              <w:bidi w:val="0"/>
+              <w:jc w:val="start"/>
+              <w:rPr>
+                <w:rFonts w:ascii="Liberation Serif" w:hAnsi="Liberation Serif"/>
+                <w:b w:val="false"/>
+                <w:bCs w:val="false"/>
+                <w:i w:val="false"/>
+                <w:i w:val="false"/>
+                <w:iCs w:val="false"/>
+                <w:strike w:val="false"/>
+                <w:dstrike w:val="false"/>
+                <w:outline w:val="false"/>
+                <w:shadow w:val="false"/>
+                <w:color w:val="000000"/>
+                <w:sz w:val="24"/>
+                <w:szCs w:val="24"/>
+                <w:u w:val="none"/>
+              </w:rPr>
+            </w:pPr>
+            <w:r>
+              <w:rPr>
+                <w:b w:val="false"/>
+                <w:bCs w:val="false"/>
+                <w:i w:val="false"/>
+                <w:iCs w:val="false"/>
+                <w:strike w:val="false"/>
+                <w:dstrike w:val="false"/>
+                <w:outline w:val="false"/>
+                <w:shadow w:val="false"/>
+                <w:color w:val="000000"/>
+                <w:sz w:val="24"/>
+                <w:szCs w:val="24"/>
+                <w:u w:val="none"/>
+              </w:rPr>
+              <w:t>findAllChains</w:t>
+            </w:r>
+          </w:p>
+        </w:tc>
+        <w:tc>
+          <w:tcPr>
+            <w:tcW w:w="1614" w:type="dxa"/>
+            <w:tcBorders>
+              <w:start w:val="single" w:sz="4" w:space="0" w:color="000000"/>
+              <w:bottom w:val="single" w:sz="4" w:space="0" w:color="000000"/>
+            </w:tcBorders>
+          </w:tcPr>
+          <w:p>
+            <w:pPr>
+              <w:pStyle w:val="TableContents"/>
+              <w:bidi w:val="0"/>
+              <w:jc w:val="start"/>
+              <w:rPr>
+                <w:rFonts w:ascii="Liberation Serif" w:hAnsi="Liberation Serif"/>
+                <w:b w:val="false"/>
+                <w:bCs w:val="false"/>
+                <w:i w:val="false"/>
+                <w:i w:val="false"/>
+                <w:iCs w:val="false"/>
+                <w:strike w:val="false"/>
+                <w:dstrike w:val="false"/>
+                <w:outline w:val="false"/>
+                <w:shadow w:val="false"/>
+                <w:color w:val="000000"/>
+                <w:sz w:val="24"/>
+                <w:szCs w:val="24"/>
+                <w:u w:val="none"/>
+              </w:rPr>
+            </w:pPr>
+            <w:r>
+              <w:rPr>
+                <w:b w:val="false"/>
+                <w:bCs w:val="false"/>
+                <w:i w:val="false"/>
+                <w:iCs w:val="false"/>
+                <w:strike w:val="false"/>
+                <w:dstrike w:val="false"/>
+                <w:outline w:val="false"/>
+                <w:shadow w:val="false"/>
+                <w:color w:val="000000"/>
+                <w:sz w:val="24"/>
+                <w:szCs w:val="24"/>
+                <w:u w:val="none"/>
+              </w:rPr>
+              <w:t>Find all CHAINs</w:t>
+            </w:r>
+          </w:p>
+        </w:tc>
+        <w:tc>
+          <w:tcPr>
+            <w:tcW w:w="1601" w:type="dxa"/>
+            <w:tcBorders>
+              <w:start w:val="single" w:sz="4" w:space="0" w:color="000000"/>
+              <w:bottom w:val="single" w:sz="4" w:space="0" w:color="000000"/>
+            </w:tcBorders>
+          </w:tcPr>
+          <w:p>
+            <w:pPr>
+              <w:pStyle w:val="TableContents"/>
+              <w:bidi w:val="0"/>
+              <w:jc w:val="start"/>
+              <w:rPr>
+                <w:rFonts w:ascii="Liberation Serif" w:hAnsi="Liberation Serif"/>
+                <w:b w:val="false"/>
+                <w:bCs w:val="false"/>
+                <w:i w:val="false"/>
+                <w:i w:val="false"/>
+                <w:iCs w:val="false"/>
+                <w:strike w:val="false"/>
+                <w:dstrike w:val="false"/>
+                <w:outline w:val="false"/>
+                <w:shadow w:val="false"/>
+                <w:color w:val="000000"/>
+                <w:sz w:val="24"/>
+                <w:szCs w:val="24"/>
+                <w:u w:val="none"/>
+              </w:rPr>
+            </w:pPr>
+            <w:r>
+              <w:rPr>
+                <w:b w:val="false"/>
+                <w:bCs w:val="false"/>
+                <w:i w:val="false"/>
+                <w:iCs w:val="false"/>
+                <w:strike w:val="false"/>
+                <w:dstrike w:val="false"/>
+                <w:outline w:val="false"/>
+                <w:shadow w:val="false"/>
+                <w:color w:val="000000"/>
+                <w:sz w:val="24"/>
+                <w:szCs w:val="24"/>
+                <w:u w:val="none"/>
+              </w:rPr>
+              <w:t>NONE</w:t>
+            </w:r>
+          </w:p>
+        </w:tc>
+        <w:tc>
+          <w:tcPr>
+            <w:tcW w:w="1612" w:type="dxa"/>
+            <w:tcBorders>
+              <w:start w:val="single" w:sz="4" w:space="0" w:color="000000"/>
+              <w:bottom w:val="single" w:sz="4" w:space="0" w:color="000000"/>
+            </w:tcBorders>
+          </w:tcPr>
+          <w:p>
+            <w:pPr>
+              <w:pStyle w:val="TableContents"/>
+              <w:bidi w:val="0"/>
+              <w:jc w:val="start"/>
+              <w:rPr>
+                <w:rFonts w:ascii="Liberation Serif" w:hAnsi="Liberation Serif"/>
+                <w:b w:val="false"/>
+                <w:bCs w:val="false"/>
+                <w:i w:val="false"/>
+                <w:i w:val="false"/>
+                <w:iCs w:val="false"/>
+                <w:strike w:val="false"/>
+                <w:dstrike w:val="false"/>
+                <w:outline w:val="false"/>
+                <w:shadow w:val="false"/>
+                <w:color w:val="000000"/>
+                <w:sz w:val="24"/>
+                <w:szCs w:val="24"/>
+                <w:u w:val="none"/>
+              </w:rPr>
+            </w:pPr>
+            <w:r>
+              <w:rPr>
+                <w:b w:val="false"/>
+                <w:bCs w:val="false"/>
+                <w:i w:val="false"/>
+                <w:iCs w:val="false"/>
+                <w:strike w:val="false"/>
+                <w:dstrike w:val="false"/>
+                <w:outline w:val="false"/>
+                <w:shadow w:val="false"/>
+                <w:color w:val="000000"/>
+                <w:sz w:val="24"/>
+                <w:szCs w:val="24"/>
+                <w:u w:val="none"/>
+              </w:rPr>
+              <w:t>NONE</w:t>
+            </w:r>
+          </w:p>
+        </w:tc>
+        <w:tc>
+          <w:tcPr>
+            <w:tcW w:w="1606" w:type="dxa"/>
+            <w:tcBorders>
+              <w:start w:val="single" w:sz="4" w:space="0" w:color="000000"/>
+              <w:bottom w:val="single" w:sz="4" w:space="0" w:color="000000"/>
+            </w:tcBorders>
+          </w:tcPr>
+          <w:p>
+            <w:pPr>
+              <w:pStyle w:val="TableContents"/>
+              <w:bidi w:val="0"/>
+              <w:jc w:val="start"/>
+              <w:rPr>
+                <w:rFonts w:ascii="Liberation Serif" w:hAnsi="Liberation Serif"/>
+                <w:b w:val="false"/>
+                <w:bCs w:val="false"/>
+                <w:i w:val="false"/>
+                <w:i w:val="false"/>
+                <w:iCs w:val="false"/>
+                <w:strike w:val="false"/>
+                <w:dstrike w:val="false"/>
+                <w:outline w:val="false"/>
+                <w:shadow w:val="false"/>
+                <w:color w:val="000000"/>
+                <w:sz w:val="24"/>
+                <w:szCs w:val="24"/>
+                <w:u w:val="none"/>
+              </w:rPr>
+            </w:pPr>
+            <w:r>
+              <w:rPr>
+                <w:b w:val="false"/>
+                <w:bCs w:val="false"/>
+                <w:i w:val="false"/>
+                <w:iCs w:val="false"/>
+                <w:strike w:val="false"/>
+                <w:dstrike w:val="false"/>
+                <w:outline w:val="false"/>
+                <w:shadow w:val="false"/>
+                <w:color w:val="000000"/>
+                <w:sz w:val="24"/>
+                <w:szCs w:val="24"/>
+                <w:u w:val="none"/>
+              </w:rPr>
+              <w:t>All CHAIN records.</w:t>
+            </w:r>
+          </w:p>
+        </w:tc>
+        <w:tc>
+          <w:tcPr>
+            <w:tcW w:w="1607" w:type="dxa"/>
+            <w:tcBorders>
+              <w:start w:val="single" w:sz="4" w:space="0" w:color="000000"/>
+              <w:bottom w:val="single" w:sz="4" w:space="0" w:color="000000"/>
+              <w:end w:val="single" w:sz="4" w:space="0" w:color="000000"/>
+            </w:tcBorders>
+          </w:tcPr>
+          <w:p>
+            <w:pPr>
+              <w:pStyle w:val="TableContents"/>
+              <w:bidi w:val="0"/>
+              <w:jc w:val="start"/>
+              <w:rPr>
+                <w:rFonts w:ascii="Liberation Serif" w:hAnsi="Liberation Serif"/>
+                <w:b w:val="false"/>
+                <w:bCs w:val="false"/>
+                <w:i w:val="false"/>
+                <w:i w:val="false"/>
+                <w:iCs w:val="false"/>
+                <w:strike w:val="false"/>
+                <w:dstrike w:val="false"/>
+                <w:outline w:val="false"/>
+                <w:shadow w:val="false"/>
+                <w:color w:val="000000"/>
+                <w:sz w:val="24"/>
+                <w:szCs w:val="24"/>
+                <w:u w:val="none"/>
+              </w:rPr>
+            </w:pPr>
+            <w:bookmarkStart w:id="3" w:name="__DdeLink__197_1060888073"/>
+            <w:r>
+              <w:rPr>
+                <w:b w:val="false"/>
+                <w:bCs w:val="false"/>
+                <w:i w:val="false"/>
+                <w:iCs w:val="false"/>
+                <w:strike w:val="false"/>
+                <w:dstrike w:val="false"/>
+                <w:outline w:val="false"/>
+                <w:shadow w:val="false"/>
+                <w:color w:val="000000"/>
+                <w:sz w:val="24"/>
+                <w:szCs w:val="24"/>
+                <w:u w:val="none"/>
+              </w:rPr>
+              <w:t xml:space="preserve">Users of all user_roles can use findAllChains. </w:t>
+            </w:r>
+            <w:bookmarkEnd w:id="3"/>
           </w:p>
         </w:tc>
       </w:tr>
@@ -1276,105 +1882,105 @@
         <w:trPr/>
         <w:tc>
           <w:tcPr>
-            <w:tcW w:w="1918" w:type="dxa"/>
-            <w:tcBorders>
-              <w:start w:val="single" w:sz="4" w:space="0" w:color="000000"/>
-              <w:bottom w:val="single" w:sz="4" w:space="0" w:color="000000"/>
-            </w:tcBorders>
-          </w:tcPr>
-          <w:p>
-            <w:pPr>
-              <w:pStyle w:val="TableContents"/>
-              <w:bidi w:val="0"/>
-              <w:jc w:val="start"/>
-              <w:rPr>
-                <w:rFonts w:ascii="Liberation Serif" w:hAnsi="Liberation Serif"/>
-                <w:b w:val="false"/>
-                <w:bCs w:val="false"/>
-                <w:i w:val="false"/>
-                <w:i w:val="false"/>
-                <w:iCs w:val="false"/>
-                <w:strike w:val="false"/>
-                <w:dstrike w:val="false"/>
-                <w:outline w:val="false"/>
-                <w:shadow w:val="false"/>
-                <w:color w:val="000000"/>
-                <w:sz w:val="24"/>
-                <w:szCs w:val="24"/>
-                <w:u w:val="none"/>
-              </w:rPr>
-            </w:pPr>
-            <w:r>
-              <w:rPr>
-                <w:b w:val="false"/>
-                <w:bCs w:val="false"/>
-                <w:i w:val="false"/>
-                <w:iCs w:val="false"/>
-                <w:strike w:val="false"/>
-                <w:dstrike w:val="false"/>
-                <w:outline w:val="false"/>
-                <w:shadow w:val="false"/>
-                <w:color w:val="000000"/>
-                <w:sz w:val="24"/>
-                <w:szCs w:val="24"/>
-                <w:u w:val="none"/>
-              </w:rPr>
-              <w:t>findAllChains</w:t>
-            </w:r>
-          </w:p>
-        </w:tc>
-        <w:tc>
-          <w:tcPr>
-            <w:tcW w:w="1937" w:type="dxa"/>
-            <w:tcBorders>
-              <w:start w:val="single" w:sz="4" w:space="0" w:color="000000"/>
-              <w:bottom w:val="single" w:sz="4" w:space="0" w:color="000000"/>
-            </w:tcBorders>
-          </w:tcPr>
-          <w:p>
-            <w:pPr>
-              <w:pStyle w:val="TableContents"/>
-              <w:bidi w:val="0"/>
-              <w:jc w:val="start"/>
-              <w:rPr>
-                <w:rFonts w:ascii="Liberation Serif" w:hAnsi="Liberation Serif"/>
-                <w:b w:val="false"/>
-                <w:bCs w:val="false"/>
-                <w:i w:val="false"/>
-                <w:i w:val="false"/>
-                <w:iCs w:val="false"/>
-                <w:strike w:val="false"/>
-                <w:dstrike w:val="false"/>
-                <w:outline w:val="false"/>
-                <w:shadow w:val="false"/>
-                <w:color w:val="000000"/>
-                <w:sz w:val="24"/>
-                <w:szCs w:val="24"/>
-                <w:u w:val="none"/>
-              </w:rPr>
-            </w:pPr>
-            <w:r>
-              <w:rPr>
-                <w:b w:val="false"/>
-                <w:bCs w:val="false"/>
-                <w:i w:val="false"/>
-                <w:iCs w:val="false"/>
-                <w:strike w:val="false"/>
-                <w:dstrike w:val="false"/>
-                <w:outline w:val="false"/>
-                <w:shadow w:val="false"/>
-                <w:color w:val="000000"/>
-                <w:sz w:val="24"/>
-                <w:szCs w:val="24"/>
-                <w:u w:val="none"/>
-              </w:rPr>
-              <w:t>Find all CHAINs</w:t>
-            </w:r>
-          </w:p>
-        </w:tc>
-        <w:tc>
-          <w:tcPr>
-            <w:tcW w:w="1921" w:type="dxa"/>
+            <w:tcW w:w="1598" w:type="dxa"/>
+            <w:tcBorders>
+              <w:start w:val="single" w:sz="4" w:space="0" w:color="000000"/>
+              <w:bottom w:val="single" w:sz="4" w:space="0" w:color="000000"/>
+            </w:tcBorders>
+          </w:tcPr>
+          <w:p>
+            <w:pPr>
+              <w:pStyle w:val="TableContents"/>
+              <w:bidi w:val="0"/>
+              <w:jc w:val="start"/>
+              <w:rPr>
+                <w:rFonts w:ascii="Liberation Serif" w:hAnsi="Liberation Serif"/>
+                <w:b w:val="false"/>
+                <w:bCs w:val="false"/>
+                <w:i w:val="false"/>
+                <w:i w:val="false"/>
+                <w:iCs w:val="false"/>
+                <w:strike w:val="false"/>
+                <w:dstrike w:val="false"/>
+                <w:outline w:val="false"/>
+                <w:shadow w:val="false"/>
+                <w:color w:val="000000"/>
+                <w:sz w:val="24"/>
+                <w:szCs w:val="24"/>
+                <w:u w:val="none"/>
+              </w:rPr>
+            </w:pPr>
+            <w:r>
+              <w:rPr>
+                <w:b w:val="false"/>
+                <w:bCs w:val="false"/>
+                <w:i w:val="false"/>
+                <w:iCs w:val="false"/>
+                <w:strike w:val="false"/>
+                <w:dstrike w:val="false"/>
+                <w:outline w:val="false"/>
+                <w:shadow w:val="false"/>
+                <w:color w:val="000000"/>
+                <w:sz w:val="24"/>
+                <w:szCs w:val="24"/>
+                <w:u w:val="none"/>
+              </w:rPr>
+              <w:t>searchChainsByName</w:t>
+            </w:r>
+          </w:p>
+        </w:tc>
+        <w:tc>
+          <w:tcPr>
+            <w:tcW w:w="1614" w:type="dxa"/>
+            <w:tcBorders>
+              <w:start w:val="single" w:sz="4" w:space="0" w:color="000000"/>
+              <w:bottom w:val="single" w:sz="4" w:space="0" w:color="000000"/>
+            </w:tcBorders>
+          </w:tcPr>
+          <w:p>
+            <w:pPr>
+              <w:pStyle w:val="TableContents"/>
+              <w:bidi w:val="0"/>
+              <w:jc w:val="start"/>
+              <w:rPr>
+                <w:rFonts w:ascii="Liberation Serif" w:hAnsi="Liberation Serif"/>
+                <w:b w:val="false"/>
+                <w:bCs w:val="false"/>
+                <w:i w:val="false"/>
+                <w:i w:val="false"/>
+                <w:iCs w:val="false"/>
+                <w:strike w:val="false"/>
+                <w:dstrike w:val="false"/>
+                <w:outline w:val="false"/>
+                <w:shadow w:val="false"/>
+                <w:color w:val="000000"/>
+                <w:sz w:val="24"/>
+                <w:szCs w:val="24"/>
+                <w:u w:val="none"/>
+              </w:rPr>
+            </w:pPr>
+            <w:r>
+              <w:rPr>
+                <w:b w:val="false"/>
+                <w:bCs w:val="false"/>
+                <w:i w:val="false"/>
+                <w:iCs w:val="false"/>
+                <w:strike w:val="false"/>
+                <w:dstrike w:val="false"/>
+                <w:outline w:val="false"/>
+                <w:shadow w:val="false"/>
+                <w:color w:val="000000"/>
+                <w:sz w:val="24"/>
+                <w:szCs w:val="24"/>
+                <w:u w:val="none"/>
+              </w:rPr>
+              <w:t>Search for a CHAIN by its chain_name.</w:t>
+            </w:r>
+          </w:p>
+        </w:tc>
+        <w:tc>
+          <w:tcPr>
+            <w:tcW w:w="1601" w:type="dxa"/>
             <w:tcBorders>
               <w:start w:val="single" w:sz="4" w:space="0" w:color="000000"/>
               <w:bottom w:val="single" w:sz="4" w:space="0" w:color="000000"/>
@@ -1423,56 +2029,105 @@
         </w:tc>
         <w:tc>
           <w:tcPr>
-            <w:tcW w:w="1934" w:type="dxa"/>
-            <w:tcBorders>
-              <w:start w:val="single" w:sz="4" w:space="0" w:color="000000"/>
-              <w:bottom w:val="single" w:sz="4" w:space="0" w:color="000000"/>
-            </w:tcBorders>
-          </w:tcPr>
-          <w:p>
-            <w:pPr>
-              <w:pStyle w:val="TableContents"/>
-              <w:bidi w:val="0"/>
-              <w:jc w:val="start"/>
-              <w:rPr>
-                <w:rFonts w:ascii="Liberation Serif" w:hAnsi="Liberation Serif"/>
-                <w:b w:val="false"/>
-                <w:bCs w:val="false"/>
-                <w:i w:val="false"/>
-                <w:i w:val="false"/>
-                <w:iCs w:val="false"/>
-                <w:strike w:val="false"/>
-                <w:dstrike w:val="false"/>
-                <w:outline w:val="false"/>
-                <w:shadow w:val="false"/>
-                <w:color w:val="000000"/>
-                <w:sz w:val="24"/>
-                <w:szCs w:val="24"/>
-                <w:u w:val="none"/>
-              </w:rPr>
-            </w:pPr>
-            <w:r>
-              <w:rPr>
-                <w:b w:val="false"/>
-                <w:bCs w:val="false"/>
-                <w:i w:val="false"/>
-                <w:iCs w:val="false"/>
-                <w:strike w:val="false"/>
-                <w:dstrike w:val="false"/>
-                <w:outline w:val="false"/>
-                <w:shadow w:val="false"/>
-                <w:color w:val="000000"/>
-                <w:sz w:val="24"/>
-                <w:szCs w:val="24"/>
-                <w:u w:val="none"/>
-              </w:rPr>
-              <w:t>NONE</w:t>
-            </w:r>
-          </w:p>
-        </w:tc>
-        <w:tc>
-          <w:tcPr>
-            <w:tcW w:w="1928" w:type="dxa"/>
+            <w:tcW w:w="1612" w:type="dxa"/>
+            <w:tcBorders>
+              <w:start w:val="single" w:sz="4" w:space="0" w:color="000000"/>
+              <w:bottom w:val="single" w:sz="4" w:space="0" w:color="000000"/>
+            </w:tcBorders>
+          </w:tcPr>
+          <w:p>
+            <w:pPr>
+              <w:pStyle w:val="TableContents"/>
+              <w:bidi w:val="0"/>
+              <w:jc w:val="start"/>
+              <w:rPr>
+                <w:rFonts w:ascii="Liberation Serif" w:hAnsi="Liberation Serif"/>
+                <w:b w:val="false"/>
+                <w:bCs w:val="false"/>
+                <w:i w:val="false"/>
+                <w:i w:val="false"/>
+                <w:iCs w:val="false"/>
+                <w:strike w:val="false"/>
+                <w:dstrike w:val="false"/>
+                <w:outline w:val="false"/>
+                <w:shadow w:val="false"/>
+                <w:color w:val="000000"/>
+                <w:sz w:val="24"/>
+                <w:szCs w:val="24"/>
+                <w:u w:val="none"/>
+              </w:rPr>
+            </w:pPr>
+            <w:r>
+              <w:rPr>
+                <w:b w:val="false"/>
+                <w:bCs w:val="false"/>
+                <w:i w:val="false"/>
+                <w:iCs w:val="false"/>
+                <w:strike w:val="false"/>
+                <w:dstrike w:val="false"/>
+                <w:outline w:val="false"/>
+                <w:shadow w:val="false"/>
+                <w:color w:val="000000"/>
+                <w:sz w:val="24"/>
+                <w:szCs w:val="24"/>
+                <w:u w:val="none"/>
+              </w:rPr>
+              <w:t>chain_name</w:t>
+            </w:r>
+          </w:p>
+        </w:tc>
+        <w:tc>
+          <w:tcPr>
+            <w:tcW w:w="1606" w:type="dxa"/>
+            <w:tcBorders>
+              <w:start w:val="single" w:sz="4" w:space="0" w:color="000000"/>
+              <w:bottom w:val="single" w:sz="4" w:space="0" w:color="000000"/>
+            </w:tcBorders>
+          </w:tcPr>
+          <w:p>
+            <w:pPr>
+              <w:pStyle w:val="TableContents"/>
+              <w:bidi w:val="0"/>
+              <w:jc w:val="start"/>
+              <w:rPr>
+                <w:rFonts w:ascii="Liberation Serif" w:hAnsi="Liberation Serif"/>
+                <w:b w:val="false"/>
+                <w:bCs w:val="false"/>
+                <w:i w:val="false"/>
+                <w:i w:val="false"/>
+                <w:iCs w:val="false"/>
+                <w:strike w:val="false"/>
+                <w:dstrike w:val="false"/>
+                <w:outline w:val="false"/>
+                <w:shadow w:val="false"/>
+                <w:color w:val="000000"/>
+                <w:sz w:val="24"/>
+                <w:szCs w:val="24"/>
+                <w:u w:val="none"/>
+              </w:rPr>
+            </w:pPr>
+            <w:r>
+              <w:rPr>
+                <w:b w:val="false"/>
+                <w:bCs w:val="false"/>
+                <w:i w:val="false"/>
+                <w:iCs w:val="false"/>
+                <w:strike w:val="false"/>
+                <w:dstrike w:val="false"/>
+                <w:outline w:val="false"/>
+                <w:shadow w:val="false"/>
+                <w:color w:val="000000"/>
+                <w:sz w:val="24"/>
+                <w:szCs w:val="24"/>
+                <w:u w:val="none"/>
+              </w:rPr>
+              <w:t>One or more CHAIN records.</w:t>
+            </w:r>
+          </w:p>
+        </w:tc>
+        <w:tc>
+          <w:tcPr>
+            <w:tcW w:w="1607" w:type="dxa"/>
             <w:tcBorders>
               <w:start w:val="single" w:sz="4" w:space="0" w:color="000000"/>
               <w:bottom w:val="single" w:sz="4" w:space="0" w:color="000000"/>
@@ -1501,23 +2156,27 @@
                 <w:u w:val="none"/>
               </w:rPr>
             </w:pPr>
-            <w:r>
-              <w:rPr>
-                <w:b w:val="false"/>
-                <w:bCs w:val="false"/>
-                <w:i w:val="false"/>
-                <w:iCs w:val="false"/>
-                <w:strike w:val="false"/>
-                <w:dstrike w:val="false"/>
-                <w:outline w:val="false"/>
-                <w:shadow w:val="false"/>
-                <w:color w:val="000000"/>
-                <w:sz w:val="24"/>
-                <w:szCs w:val="24"/>
-                <w:u w:val="none"/>
-              </w:rPr>
-              <w:t>All CHAIN records.</w:t>
-            </w:r>
+            <w:bookmarkStart w:id="4" w:name="__DdeLink__202_1060888073"/>
+            <w:bookmarkStart w:id="5" w:name="__DdeLink__199_1060888073"/>
+            <w:r>
+              <w:rPr>
+                <w:b w:val="false"/>
+                <w:bCs w:val="false"/>
+                <w:i w:val="false"/>
+                <w:iCs w:val="false"/>
+                <w:strike w:val="false"/>
+                <w:dstrike w:val="false"/>
+                <w:outline w:val="false"/>
+                <w:shadow w:val="false"/>
+                <w:color w:val="000000"/>
+                <w:sz w:val="24"/>
+                <w:szCs w:val="24"/>
+                <w:u w:val="none"/>
+              </w:rPr>
+              <w:t xml:space="preserve">Users of all user_roles can use searchChainsByName. </w:t>
+            </w:r>
+            <w:bookmarkEnd w:id="4"/>
+            <w:bookmarkEnd w:id="5"/>
           </w:p>
         </w:tc>
       </w:tr>
@@ -1525,105 +2184,105 @@
         <w:trPr/>
         <w:tc>
           <w:tcPr>
-            <w:tcW w:w="1918" w:type="dxa"/>
-            <w:tcBorders>
-              <w:start w:val="single" w:sz="4" w:space="0" w:color="000000"/>
-              <w:bottom w:val="single" w:sz="4" w:space="0" w:color="000000"/>
-            </w:tcBorders>
-          </w:tcPr>
-          <w:p>
-            <w:pPr>
-              <w:pStyle w:val="TableContents"/>
-              <w:bidi w:val="0"/>
-              <w:jc w:val="start"/>
-              <w:rPr>
-                <w:rFonts w:ascii="Liberation Serif" w:hAnsi="Liberation Serif"/>
-                <w:b w:val="false"/>
-                <w:bCs w:val="false"/>
-                <w:i w:val="false"/>
-                <w:i w:val="false"/>
-                <w:iCs w:val="false"/>
-                <w:strike w:val="false"/>
-                <w:dstrike w:val="false"/>
-                <w:outline w:val="false"/>
-                <w:shadow w:val="false"/>
-                <w:color w:val="000000"/>
-                <w:sz w:val="24"/>
-                <w:szCs w:val="24"/>
-                <w:u w:val="none"/>
-              </w:rPr>
-            </w:pPr>
-            <w:r>
-              <w:rPr>
-                <w:b w:val="false"/>
-                <w:bCs w:val="false"/>
-                <w:i w:val="false"/>
-                <w:iCs w:val="false"/>
-                <w:strike w:val="false"/>
-                <w:dstrike w:val="false"/>
-                <w:outline w:val="false"/>
-                <w:shadow w:val="false"/>
-                <w:color w:val="000000"/>
-                <w:sz w:val="24"/>
-                <w:szCs w:val="24"/>
-                <w:u w:val="none"/>
-              </w:rPr>
-              <w:t>searchChainsByName</w:t>
-            </w:r>
-          </w:p>
-        </w:tc>
-        <w:tc>
-          <w:tcPr>
-            <w:tcW w:w="1937" w:type="dxa"/>
-            <w:tcBorders>
-              <w:start w:val="single" w:sz="4" w:space="0" w:color="000000"/>
-              <w:bottom w:val="single" w:sz="4" w:space="0" w:color="000000"/>
-            </w:tcBorders>
-          </w:tcPr>
-          <w:p>
-            <w:pPr>
-              <w:pStyle w:val="TableContents"/>
-              <w:bidi w:val="0"/>
-              <w:jc w:val="start"/>
-              <w:rPr>
-                <w:rFonts w:ascii="Liberation Serif" w:hAnsi="Liberation Serif"/>
-                <w:b w:val="false"/>
-                <w:bCs w:val="false"/>
-                <w:i w:val="false"/>
-                <w:i w:val="false"/>
-                <w:iCs w:val="false"/>
-                <w:strike w:val="false"/>
-                <w:dstrike w:val="false"/>
-                <w:outline w:val="false"/>
-                <w:shadow w:val="false"/>
-                <w:color w:val="000000"/>
-                <w:sz w:val="24"/>
-                <w:szCs w:val="24"/>
-                <w:u w:val="none"/>
-              </w:rPr>
-            </w:pPr>
-            <w:r>
-              <w:rPr>
-                <w:b w:val="false"/>
-                <w:bCs w:val="false"/>
-                <w:i w:val="false"/>
-                <w:iCs w:val="false"/>
-                <w:strike w:val="false"/>
-                <w:dstrike w:val="false"/>
-                <w:outline w:val="false"/>
-                <w:shadow w:val="false"/>
-                <w:color w:val="000000"/>
-                <w:sz w:val="24"/>
-                <w:szCs w:val="24"/>
-                <w:u w:val="none"/>
-              </w:rPr>
-              <w:t>Search for a CHAIN by its chain_name.</w:t>
-            </w:r>
-          </w:p>
-        </w:tc>
-        <w:tc>
-          <w:tcPr>
-            <w:tcW w:w="1921" w:type="dxa"/>
+            <w:tcW w:w="1598" w:type="dxa"/>
+            <w:tcBorders>
+              <w:start w:val="single" w:sz="4" w:space="0" w:color="000000"/>
+              <w:bottom w:val="single" w:sz="4" w:space="0" w:color="000000"/>
+            </w:tcBorders>
+          </w:tcPr>
+          <w:p>
+            <w:pPr>
+              <w:pStyle w:val="TableContents"/>
+              <w:bidi w:val="0"/>
+              <w:jc w:val="start"/>
+              <w:rPr>
+                <w:rFonts w:ascii="Liberation Serif" w:hAnsi="Liberation Serif"/>
+                <w:b w:val="false"/>
+                <w:bCs w:val="false"/>
+                <w:i w:val="false"/>
+                <w:i w:val="false"/>
+                <w:iCs w:val="false"/>
+                <w:strike w:val="false"/>
+                <w:dstrike w:val="false"/>
+                <w:outline w:val="false"/>
+                <w:shadow w:val="false"/>
+                <w:color w:val="000000"/>
+                <w:sz w:val="24"/>
+                <w:szCs w:val="24"/>
+                <w:u w:val="none"/>
+              </w:rPr>
+            </w:pPr>
+            <w:r>
+              <w:rPr>
+                <w:b w:val="false"/>
+                <w:bCs w:val="false"/>
+                <w:i w:val="false"/>
+                <w:iCs w:val="false"/>
+                <w:strike w:val="false"/>
+                <w:dstrike w:val="false"/>
+                <w:outline w:val="false"/>
+                <w:shadow w:val="false"/>
+                <w:color w:val="000000"/>
+                <w:sz w:val="24"/>
+                <w:szCs w:val="24"/>
+                <w:u w:val="none"/>
+              </w:rPr>
+              <w:t>removeChain</w:t>
+            </w:r>
+          </w:p>
+        </w:tc>
+        <w:tc>
+          <w:tcPr>
+            <w:tcW w:w="1614" w:type="dxa"/>
+            <w:tcBorders>
+              <w:start w:val="single" w:sz="4" w:space="0" w:color="000000"/>
+              <w:bottom w:val="single" w:sz="4" w:space="0" w:color="000000"/>
+            </w:tcBorders>
+          </w:tcPr>
+          <w:p>
+            <w:pPr>
+              <w:pStyle w:val="TableContents"/>
+              <w:bidi w:val="0"/>
+              <w:jc w:val="start"/>
+              <w:rPr>
+                <w:rFonts w:ascii="Liberation Serif" w:hAnsi="Liberation Serif"/>
+                <w:b w:val="false"/>
+                <w:bCs w:val="false"/>
+                <w:i w:val="false"/>
+                <w:i w:val="false"/>
+                <w:iCs w:val="false"/>
+                <w:strike w:val="false"/>
+                <w:dstrike w:val="false"/>
+                <w:outline w:val="false"/>
+                <w:shadow w:val="false"/>
+                <w:color w:val="000000"/>
+                <w:sz w:val="24"/>
+                <w:szCs w:val="24"/>
+                <w:u w:val="none"/>
+              </w:rPr>
+            </w:pPr>
+            <w:r>
+              <w:rPr>
+                <w:b w:val="false"/>
+                <w:bCs w:val="false"/>
+                <w:i w:val="false"/>
+                <w:iCs w:val="false"/>
+                <w:strike w:val="false"/>
+                <w:dstrike w:val="false"/>
+                <w:outline w:val="false"/>
+                <w:shadow w:val="false"/>
+                <w:color w:val="000000"/>
+                <w:sz w:val="24"/>
+                <w:szCs w:val="24"/>
+                <w:u w:val="none"/>
+              </w:rPr>
+              <w:t>Delete a CHAIN using chain_id.</w:t>
+            </w:r>
+          </w:p>
+        </w:tc>
+        <w:tc>
+          <w:tcPr>
+            <w:tcW w:w="1601" w:type="dxa"/>
             <w:tcBorders>
               <w:start w:val="single" w:sz="4" w:space="0" w:color="000000"/>
               <w:bottom w:val="single" w:sz="4" w:space="0" w:color="000000"/>
@@ -1672,56 +2331,105 @@
         </w:tc>
         <w:tc>
           <w:tcPr>
-            <w:tcW w:w="1934" w:type="dxa"/>
-            <w:tcBorders>
-              <w:start w:val="single" w:sz="4" w:space="0" w:color="000000"/>
-              <w:bottom w:val="single" w:sz="4" w:space="0" w:color="000000"/>
-            </w:tcBorders>
-          </w:tcPr>
-          <w:p>
-            <w:pPr>
-              <w:pStyle w:val="TableContents"/>
-              <w:bidi w:val="0"/>
-              <w:jc w:val="start"/>
-              <w:rPr>
-                <w:rFonts w:ascii="Liberation Serif" w:hAnsi="Liberation Serif"/>
-                <w:b w:val="false"/>
-                <w:bCs w:val="false"/>
-                <w:i w:val="false"/>
-                <w:i w:val="false"/>
-                <w:iCs w:val="false"/>
-                <w:strike w:val="false"/>
-                <w:dstrike w:val="false"/>
-                <w:outline w:val="false"/>
-                <w:shadow w:val="false"/>
-                <w:color w:val="000000"/>
-                <w:sz w:val="24"/>
-                <w:szCs w:val="24"/>
-                <w:u w:val="none"/>
-              </w:rPr>
-            </w:pPr>
-            <w:r>
-              <w:rPr>
-                <w:b w:val="false"/>
-                <w:bCs w:val="false"/>
-                <w:i w:val="false"/>
-                <w:iCs w:val="false"/>
-                <w:strike w:val="false"/>
-                <w:dstrike w:val="false"/>
-                <w:outline w:val="false"/>
-                <w:shadow w:val="false"/>
-                <w:color w:val="000000"/>
-                <w:sz w:val="24"/>
-                <w:szCs w:val="24"/>
-                <w:u w:val="none"/>
-              </w:rPr>
-              <w:t>chain_name</w:t>
-            </w:r>
-          </w:p>
-        </w:tc>
-        <w:tc>
-          <w:tcPr>
-            <w:tcW w:w="1928" w:type="dxa"/>
+            <w:tcW w:w="1612" w:type="dxa"/>
+            <w:tcBorders>
+              <w:start w:val="single" w:sz="4" w:space="0" w:color="000000"/>
+              <w:bottom w:val="single" w:sz="4" w:space="0" w:color="000000"/>
+            </w:tcBorders>
+          </w:tcPr>
+          <w:p>
+            <w:pPr>
+              <w:pStyle w:val="TableContents"/>
+              <w:bidi w:val="0"/>
+              <w:jc w:val="start"/>
+              <w:rPr>
+                <w:rFonts w:ascii="Liberation Serif" w:hAnsi="Liberation Serif"/>
+                <w:b w:val="false"/>
+                <w:bCs w:val="false"/>
+                <w:i w:val="false"/>
+                <w:i w:val="false"/>
+                <w:iCs w:val="false"/>
+                <w:strike w:val="false"/>
+                <w:dstrike w:val="false"/>
+                <w:outline w:val="false"/>
+                <w:shadow w:val="false"/>
+                <w:color w:val="000000"/>
+                <w:sz w:val="24"/>
+                <w:szCs w:val="24"/>
+                <w:u w:val="none"/>
+              </w:rPr>
+            </w:pPr>
+            <w:r>
+              <w:rPr>
+                <w:b w:val="false"/>
+                <w:bCs w:val="false"/>
+                <w:i w:val="false"/>
+                <w:iCs w:val="false"/>
+                <w:strike w:val="false"/>
+                <w:dstrike w:val="false"/>
+                <w:outline w:val="false"/>
+                <w:shadow w:val="false"/>
+                <w:color w:val="000000"/>
+                <w:sz w:val="24"/>
+                <w:szCs w:val="24"/>
+                <w:u w:val="none"/>
+              </w:rPr>
+              <w:t>chainId</w:t>
+            </w:r>
+          </w:p>
+        </w:tc>
+        <w:tc>
+          <w:tcPr>
+            <w:tcW w:w="1606" w:type="dxa"/>
+            <w:tcBorders>
+              <w:start w:val="single" w:sz="4" w:space="0" w:color="000000"/>
+              <w:bottom w:val="single" w:sz="4" w:space="0" w:color="000000"/>
+            </w:tcBorders>
+          </w:tcPr>
+          <w:p>
+            <w:pPr>
+              <w:pStyle w:val="TableContents"/>
+              <w:bidi w:val="0"/>
+              <w:jc w:val="start"/>
+              <w:rPr>
+                <w:rFonts w:ascii="Liberation Serif" w:hAnsi="Liberation Serif"/>
+                <w:b w:val="false"/>
+                <w:bCs w:val="false"/>
+                <w:i w:val="false"/>
+                <w:i w:val="false"/>
+                <w:iCs w:val="false"/>
+                <w:strike w:val="false"/>
+                <w:dstrike w:val="false"/>
+                <w:outline w:val="false"/>
+                <w:shadow w:val="false"/>
+                <w:color w:val="000000"/>
+                <w:sz w:val="24"/>
+                <w:szCs w:val="24"/>
+                <w:u w:val="none"/>
+              </w:rPr>
+            </w:pPr>
+            <w:r>
+              <w:rPr>
+                <w:b w:val="false"/>
+                <w:bCs w:val="false"/>
+                <w:i w:val="false"/>
+                <w:iCs w:val="false"/>
+                <w:strike w:val="false"/>
+                <w:dstrike w:val="false"/>
+                <w:outline w:val="false"/>
+                <w:shadow w:val="false"/>
+                <w:color w:val="000000"/>
+                <w:sz w:val="24"/>
+                <w:szCs w:val="24"/>
+                <w:u w:val="none"/>
+              </w:rPr>
+              <w:t>Deleted CHAIN record.</w:t>
+            </w:r>
+          </w:p>
+        </w:tc>
+        <w:tc>
+          <w:tcPr>
+            <w:tcW w:w="1607" w:type="dxa"/>
             <w:tcBorders>
               <w:start w:val="single" w:sz="4" w:space="0" w:color="000000"/>
               <w:bottom w:val="single" w:sz="4" w:space="0" w:color="000000"/>
@@ -1765,307 +2473,7 @@
                 <w:szCs w:val="24"/>
                 <w:u w:val="none"/>
               </w:rPr>
-              <w:t>One or more CHAIN records.</w:t>
-            </w:r>
-          </w:p>
-        </w:tc>
-      </w:tr>
-      <w:tr>
-        <w:trPr/>
-        <w:tc>
-          <w:tcPr>
-            <w:tcW w:w="1918" w:type="dxa"/>
-            <w:tcBorders>
-              <w:start w:val="single" w:sz="4" w:space="0" w:color="000000"/>
-              <w:bottom w:val="single" w:sz="4" w:space="0" w:color="000000"/>
-            </w:tcBorders>
-          </w:tcPr>
-          <w:p>
-            <w:pPr>
-              <w:pStyle w:val="TableContents"/>
-              <w:bidi w:val="0"/>
-              <w:jc w:val="start"/>
-              <w:rPr>
-                <w:rFonts w:ascii="Liberation Serif" w:hAnsi="Liberation Serif"/>
-                <w:b w:val="false"/>
-                <w:bCs w:val="false"/>
-                <w:i w:val="false"/>
-                <w:i w:val="false"/>
-                <w:iCs w:val="false"/>
-                <w:strike w:val="false"/>
-                <w:dstrike w:val="false"/>
-                <w:outline w:val="false"/>
-                <w:shadow w:val="false"/>
-                <w:color w:val="000000"/>
-                <w:sz w:val="24"/>
-                <w:szCs w:val="24"/>
-                <w:u w:val="none"/>
-              </w:rPr>
-            </w:pPr>
-            <w:r>
-              <w:rPr>
-                <w:b w:val="false"/>
-                <w:bCs w:val="false"/>
-                <w:i w:val="false"/>
-                <w:iCs w:val="false"/>
-                <w:strike w:val="false"/>
-                <w:dstrike w:val="false"/>
-                <w:outline w:val="false"/>
-                <w:shadow w:val="false"/>
-                <w:color w:val="000000"/>
-                <w:sz w:val="24"/>
-                <w:szCs w:val="24"/>
-                <w:u w:val="none"/>
-              </w:rPr>
-              <w:t>removeChain</w:t>
-            </w:r>
-          </w:p>
-        </w:tc>
-        <w:tc>
-          <w:tcPr>
-            <w:tcW w:w="1937" w:type="dxa"/>
-            <w:tcBorders>
-              <w:start w:val="single" w:sz="4" w:space="0" w:color="000000"/>
-              <w:bottom w:val="single" w:sz="4" w:space="0" w:color="000000"/>
-            </w:tcBorders>
-          </w:tcPr>
-          <w:p>
-            <w:pPr>
-              <w:pStyle w:val="TableContents"/>
-              <w:bidi w:val="0"/>
-              <w:jc w:val="start"/>
-              <w:rPr>
-                <w:rFonts w:ascii="Liberation Serif" w:hAnsi="Liberation Serif"/>
-                <w:b w:val="false"/>
-                <w:bCs w:val="false"/>
-                <w:i w:val="false"/>
-                <w:i w:val="false"/>
-                <w:iCs w:val="false"/>
-                <w:strike w:val="false"/>
-                <w:dstrike w:val="false"/>
-                <w:outline w:val="false"/>
-                <w:shadow w:val="false"/>
-                <w:color w:val="000000"/>
-                <w:sz w:val="24"/>
-                <w:szCs w:val="24"/>
-                <w:u w:val="none"/>
-              </w:rPr>
-            </w:pPr>
-            <w:r>
-              <w:rPr>
-                <w:b w:val="false"/>
-                <w:bCs w:val="false"/>
-                <w:i w:val="false"/>
-                <w:iCs w:val="false"/>
-                <w:strike w:val="false"/>
-                <w:dstrike w:val="false"/>
-                <w:outline w:val="false"/>
-                <w:shadow w:val="false"/>
-                <w:color w:val="000000"/>
-                <w:sz w:val="24"/>
-                <w:szCs w:val="24"/>
-                <w:u w:val="none"/>
-              </w:rPr>
-              <w:t>Delete a CHAIN using chain_</w:t>
-            </w:r>
-            <w:r>
-              <w:rPr>
-                <w:b w:val="false"/>
-                <w:bCs w:val="false"/>
-                <w:i w:val="false"/>
-                <w:iCs w:val="false"/>
-                <w:strike w:val="false"/>
-                <w:dstrike w:val="false"/>
-                <w:outline w:val="false"/>
-                <w:shadow w:val="false"/>
-                <w:color w:val="000000"/>
-                <w:sz w:val="24"/>
-                <w:szCs w:val="24"/>
-                <w:u w:val="none"/>
-              </w:rPr>
-              <w:t>id</w:t>
-            </w:r>
-            <w:r>
-              <w:rPr>
-                <w:b w:val="false"/>
-                <w:bCs w:val="false"/>
-                <w:i w:val="false"/>
-                <w:iCs w:val="false"/>
-                <w:strike w:val="false"/>
-                <w:dstrike w:val="false"/>
-                <w:outline w:val="false"/>
-                <w:shadow w:val="false"/>
-                <w:color w:val="000000"/>
-                <w:sz w:val="24"/>
-                <w:szCs w:val="24"/>
-                <w:u w:val="none"/>
-              </w:rPr>
-              <w:t>.</w:t>
-            </w:r>
-          </w:p>
-        </w:tc>
-        <w:tc>
-          <w:tcPr>
-            <w:tcW w:w="1921" w:type="dxa"/>
-            <w:tcBorders>
-              <w:start w:val="single" w:sz="4" w:space="0" w:color="000000"/>
-              <w:bottom w:val="single" w:sz="4" w:space="0" w:color="000000"/>
-            </w:tcBorders>
-          </w:tcPr>
-          <w:p>
-            <w:pPr>
-              <w:pStyle w:val="TableContents"/>
-              <w:bidi w:val="0"/>
-              <w:jc w:val="start"/>
-              <w:rPr>
-                <w:rFonts w:ascii="Liberation Serif" w:hAnsi="Liberation Serif"/>
-                <w:b w:val="false"/>
-                <w:bCs w:val="false"/>
-                <w:i w:val="false"/>
-                <w:i w:val="false"/>
-                <w:iCs w:val="false"/>
-                <w:strike w:val="false"/>
-                <w:dstrike w:val="false"/>
-                <w:outline w:val="false"/>
-                <w:shadow w:val="false"/>
-                <w:color w:val="000000"/>
-                <w:sz w:val="24"/>
-                <w:szCs w:val="24"/>
-                <w:u w:val="none"/>
-              </w:rPr>
-            </w:pPr>
-            <w:r>
-              <w:rPr>
-                <w:b w:val="false"/>
-                <w:bCs w:val="false"/>
-                <w:i w:val="false"/>
-                <w:iCs w:val="false"/>
-                <w:strike w:val="false"/>
-                <w:dstrike w:val="false"/>
-                <w:outline w:val="false"/>
-                <w:shadow w:val="false"/>
-                <w:color w:val="000000"/>
-                <w:sz w:val="24"/>
-                <w:szCs w:val="24"/>
-                <w:u w:val="none"/>
-              </w:rPr>
-              <w:t>NONE</w:t>
-            </w:r>
-          </w:p>
-        </w:tc>
-        <w:tc>
-          <w:tcPr>
-            <w:tcW w:w="1934" w:type="dxa"/>
-            <w:tcBorders>
-              <w:start w:val="single" w:sz="4" w:space="0" w:color="000000"/>
-              <w:bottom w:val="single" w:sz="4" w:space="0" w:color="000000"/>
-            </w:tcBorders>
-          </w:tcPr>
-          <w:p>
-            <w:pPr>
-              <w:pStyle w:val="TableContents"/>
-              <w:bidi w:val="0"/>
-              <w:jc w:val="start"/>
-              <w:rPr>
-                <w:rFonts w:ascii="Liberation Serif" w:hAnsi="Liberation Serif"/>
-                <w:b w:val="false"/>
-                <w:bCs w:val="false"/>
-                <w:i w:val="false"/>
-                <w:i w:val="false"/>
-                <w:iCs w:val="false"/>
-                <w:strike w:val="false"/>
-                <w:dstrike w:val="false"/>
-                <w:outline w:val="false"/>
-                <w:shadow w:val="false"/>
-                <w:color w:val="000000"/>
-                <w:sz w:val="24"/>
-                <w:szCs w:val="24"/>
-                <w:u w:val="none"/>
-              </w:rPr>
-            </w:pPr>
-            <w:r>
-              <w:rPr>
-                <w:b w:val="false"/>
-                <w:bCs w:val="false"/>
-                <w:i w:val="false"/>
-                <w:iCs w:val="false"/>
-                <w:strike w:val="false"/>
-                <w:dstrike w:val="false"/>
-                <w:outline w:val="false"/>
-                <w:shadow w:val="false"/>
-                <w:color w:val="000000"/>
-                <w:sz w:val="24"/>
-                <w:szCs w:val="24"/>
-                <w:u w:val="none"/>
-              </w:rPr>
-              <w:t>chain</w:t>
-            </w:r>
-            <w:r>
-              <w:rPr>
-                <w:b w:val="false"/>
-                <w:bCs w:val="false"/>
-                <w:i w:val="false"/>
-                <w:iCs w:val="false"/>
-                <w:strike w:val="false"/>
-                <w:dstrike w:val="false"/>
-                <w:outline w:val="false"/>
-                <w:shadow w:val="false"/>
-                <w:color w:val="000000"/>
-                <w:sz w:val="24"/>
-                <w:szCs w:val="24"/>
-                <w:u w:val="none"/>
-              </w:rPr>
-              <w:t>Id</w:t>
-            </w:r>
-          </w:p>
-        </w:tc>
-        <w:tc>
-          <w:tcPr>
-            <w:tcW w:w="1928" w:type="dxa"/>
-            <w:tcBorders>
-              <w:start w:val="single" w:sz="4" w:space="0" w:color="000000"/>
-              <w:bottom w:val="single" w:sz="4" w:space="0" w:color="000000"/>
-              <w:end w:val="single" w:sz="4" w:space="0" w:color="000000"/>
-            </w:tcBorders>
-          </w:tcPr>
-          <w:p>
-            <w:pPr>
-              <w:pStyle w:val="TableContents"/>
-              <w:bidi w:val="0"/>
-              <w:jc w:val="start"/>
-              <w:rPr>
-                <w:rFonts w:ascii="Liberation Serif" w:hAnsi="Liberation Serif"/>
-                <w:b w:val="false"/>
-                <w:bCs w:val="false"/>
-                <w:i w:val="false"/>
-                <w:i w:val="false"/>
-                <w:iCs w:val="false"/>
-                <w:strike w:val="false"/>
-                <w:dstrike w:val="false"/>
-                <w:outline w:val="false"/>
-                <w:shadow w:val="false"/>
-                <w:color w:val="000000"/>
-                <w:sz w:val="24"/>
-                <w:szCs w:val="24"/>
-                <w:u w:val="none"/>
-              </w:rPr>
-            </w:pPr>
-            <w:r>
-              <w:rPr>
-                <w:b w:val="false"/>
-                <w:bCs w:val="false"/>
-                <w:i w:val="false"/>
-                <w:iCs w:val="false"/>
-                <w:strike w:val="false"/>
-                <w:dstrike w:val="false"/>
-                <w:outline w:val="false"/>
-                <w:shadow w:val="false"/>
-                <w:color w:val="000000"/>
-                <w:sz w:val="24"/>
-                <w:szCs w:val="24"/>
-                <w:u w:val="none"/>
-              </w:rPr>
-              <w:t>Deleted CHAIN record.</w:t>
+              <w:t>A chain can only be removed by a comapny_manager or a chain_manager. The logged_in user’s user_role should be checked.</w:t>
             </w:r>
           </w:p>
         </w:tc>
@@ -2215,7 +2623,7 @@
           <w:bCs w:val="false"/>
         </w:rPr>
       </w:pPr>
-      <w:bookmarkStart w:id="0" w:name="__DdeLink__149_588342144"/>
+      <w:bookmarkStart w:id="6" w:name="__DdeLink__149_588342144"/>
       <w:r>
         <w:rPr>
           <w:b w:val="false"/>
@@ -2223,7 +2631,7 @@
         </w:rPr>
         <w:t xml:space="preserve">findOneChain -&gt; Takes the </w:t>
       </w:r>
-      <w:bookmarkStart w:id="1" w:name="__DdeLink__443_1184157458"/>
+      <w:bookmarkStart w:id="7" w:name="__DdeLink__443_1184157458"/>
       <w:r>
         <w:rPr>
           <w:b w:val="false"/>
@@ -2231,7 +2639,7 @@
         </w:rPr>
         <w:t>chain_id from the URL parameter from the front-end</w:t>
       </w:r>
-      <w:bookmarkEnd w:id="1"/>
+      <w:bookmarkEnd w:id="7"/>
       <w:r>
         <w:rPr>
           <w:b w:val="false"/>
@@ -2239,7 +2647,7 @@
         </w:rPr>
         <w:t xml:space="preserve"> and returns the respective CHAIN record.</w:t>
       </w:r>
-      <w:bookmarkEnd w:id="0"/>
+      <w:bookmarkEnd w:id="6"/>
     </w:p>
     <w:p>
       <w:pPr>
@@ -2549,12 +2957,12 @@
         <w:jc w:val="start"/>
         <w:rPr/>
       </w:pPr>
-      <w:bookmarkStart w:id="2" w:name="__DdeLink__92_3803631280"/>
+      <w:bookmarkStart w:id="8" w:name="__DdeLink__92_3803631280"/>
       <w:r>
         <w:rPr/>
         <w:t>* Create a CHAIN tuple without the chain_headquarters_address_city.</w:t>
       </w:r>
-      <w:bookmarkEnd w:id="2"/>
+      <w:bookmarkEnd w:id="8"/>
     </w:p>
     <w:p>
       <w:pPr>
@@ -2657,12 +3065,12 @@
         <w:jc w:val="start"/>
         <w:rPr/>
       </w:pPr>
-      <w:bookmarkStart w:id="3" w:name="__DdeLink__100_3803631280"/>
+      <w:bookmarkStart w:id="9" w:name="__DdeLink__100_3803631280"/>
       <w:r>
         <w:rPr/>
         <w:t>For UpdateChainAddress, the following tests:</w:t>
       </w:r>
-      <w:bookmarkEnd w:id="3"/>
+      <w:bookmarkEnd w:id="9"/>
     </w:p>
     <w:p>
       <w:pPr>
@@ -2683,12 +3091,12 @@
         <w:jc w:val="start"/>
         <w:rPr/>
       </w:pPr>
-      <w:bookmarkStart w:id="4" w:name="__DdeLink__94_3803631280"/>
+      <w:bookmarkStart w:id="10" w:name="__DdeLink__94_3803631280"/>
       <w:r>
         <w:rPr/>
         <w:t>* Update the CHAIN’s chain_headquarters_address_city.</w:t>
       </w:r>
-      <w:bookmarkEnd w:id="4"/>
+      <w:bookmarkEnd w:id="10"/>
     </w:p>
     <w:p>
       <w:pPr>
@@ -2701,12 +3109,12 @@
         <w:rPr/>
         <w:t xml:space="preserve">* </w:t>
       </w:r>
-      <w:bookmarkStart w:id="5" w:name="__DdeLink__96_3803631280"/>
+      <w:bookmarkStart w:id="11" w:name="__DdeLink__96_3803631280"/>
       <w:r>
         <w:rPr/>
         <w:t>Update the CHAIN’s chain_headquarters_address_street</w:t>
       </w:r>
-      <w:bookmarkEnd w:id="5"/>
+      <w:bookmarkEnd w:id="11"/>
       <w:r>
         <w:rPr/>
         <w:t>.</w:t>
@@ -2719,12 +3127,12 @@
         <w:jc w:val="start"/>
         <w:rPr/>
       </w:pPr>
-      <w:bookmarkStart w:id="6" w:name="__DdeLink__98_3803631280"/>
+      <w:bookmarkStart w:id="12" w:name="__DdeLink__98_3803631280"/>
       <w:r>
         <w:rPr/>
         <w:t>* Update the CHAIN’s chain_headquarters_address_country.</w:t>
       </w:r>
-      <w:bookmarkEnd w:id="6"/>
+      <w:bookmarkEnd w:id="12"/>
     </w:p>
     <w:p>
       <w:pPr>
@@ -2804,16 +3212,16 @@
         <w:jc w:val="start"/>
         <w:rPr/>
       </w:pPr>
-      <w:bookmarkStart w:id="7" w:name="__DdeLink__296_1992960000"/>
-      <w:bookmarkStart w:id="8" w:name="__DdeLink__142_2312781727"/>
-      <w:bookmarkStart w:id="9" w:name="__DdeLink__139_2312781727"/>
+      <w:bookmarkStart w:id="13" w:name="__DdeLink__139_2312781727"/>
+      <w:bookmarkStart w:id="14" w:name="__DdeLink__142_2312781727"/>
+      <w:bookmarkStart w:id="15" w:name="__DdeLink__296_1992960000"/>
       <w:r>
         <w:rPr/>
         <w:t>* Delete the CHAIN with chain_id 12.</w:t>
       </w:r>
-      <w:bookmarkEnd w:id="7"/>
-      <w:bookmarkEnd w:id="8"/>
-      <w:bookmarkEnd w:id="9"/>
+      <w:bookmarkEnd w:id="13"/>
+      <w:bookmarkEnd w:id="14"/>
+      <w:bookmarkEnd w:id="15"/>
     </w:p>
     <w:p>
       <w:pPr>
@@ -2862,12 +3270,12 @@
         <w:jc w:val="start"/>
         <w:rPr/>
       </w:pPr>
-      <w:bookmarkStart w:id="10" w:name="__DdeLink__138_2894387740"/>
+      <w:bookmarkStart w:id="16" w:name="__DdeLink__138_2894387740"/>
       <w:r>
         <w:rPr/>
         <w:t>* Add another CHAIN named “Test Chain” with the following details (chain_date_created_at, chain_headquarters_address_room_no, chain_headquarters_address_building, chain_headquarters_address_street, chain_headquarters_address_city, chain_headquarters_address_admin_division, chain_headquarters_address_country, chain_headquarters_address_post_code) (Test Chain', '14, 'Test Building 2', 'Test Street 2', 'Test City Two', 'Test Division Twoo', 'India', '560001)</w:t>
       </w:r>
-      <w:bookmarkEnd w:id="10"/>
+      <w:bookmarkEnd w:id="16"/>
     </w:p>
     <w:p>
       <w:pPr>
@@ -2936,14 +3344,14 @@
         <w:jc w:val="start"/>
         <w:rPr/>
       </w:pPr>
-      <w:bookmarkStart w:id="11" w:name="__DdeLink__133_2894387740"/>
-      <w:bookmarkStart w:id="12" w:name="__DdeLink__136_2894387740"/>
+      <w:bookmarkStart w:id="17" w:name="__DdeLink__136_2894387740"/>
+      <w:bookmarkStart w:id="18" w:name="__DdeLink__133_2894387740"/>
       <w:r>
         <w:rPr/>
         <w:t>NOTE: “Test Chain” has chain_ id = 4.</w:t>
       </w:r>
-      <w:bookmarkEnd w:id="11"/>
-      <w:bookmarkEnd w:id="12"/>
+      <w:bookmarkEnd w:id="17"/>
+      <w:bookmarkEnd w:id="18"/>
     </w:p>
     <w:sectPr>
       <w:type w:val="nextPage"/>
@@ -2982,7 +3390,7 @@
     <w:pPr>
       <w:widowControl/>
       <w:suppressAutoHyphens w:val="true"/>
-      <w:overflowPunct w:val="true"/>
+      <w:overflowPunct w:val="false"/>
       <w:bidi w:val="0"/>
       <w:spacing w:before="0" w:after="0"/>
       <w:jc w:val="start"/>
@@ -3063,6 +3471,19 @@
       <w:suppressLineNumbers/>
     </w:pPr>
     <w:rPr/>
+  </w:style>
+  <w:style w:type="paragraph" w:styleId="TableHeading">
+    <w:name w:val="Table Heading"/>
+    <w:basedOn w:val="TableContents"/>
+    <w:qFormat/>
+    <w:pPr>
+      <w:suppressLineNumbers/>
+      <w:jc w:val="center"/>
+    </w:pPr>
+    <w:rPr>
+      <w:b/>
+      <w:bCs/>
+    </w:rPr>
   </w:style>
 </w:styles>
 </file>

</xml_diff>